<commit_message>
ADC init (DMA mode)
</commit_message>
<xml_diff>
--- a/ЗАДАНИЯ.docx
+++ b/ЗАДАНИЯ.docx
@@ -13892,7 +13892,7 @@
                 <w:color w:val="000000"/>
                 <w:sz w:val="28"/>
                 <w:szCs w:val="28"/>
-                <w:lang w:val="en-US" w:eastAsia="ru-RU"/>
+                <w:lang w:eastAsia="ru-RU"/>
               </w:rPr>
             </w:pPr>
             <w:proofErr w:type="spellStart"/>
@@ -19500,12 +19500,12 @@
     </w:p>
     <w:tbl>
       <w:tblPr>
-        <w:tblW w:w="9229" w:type="dxa"/>
-        <w:tblInd w:w="93" w:type="dxa"/>
+        <w:tblW w:w="8647" w:type="dxa"/>
+        <w:tblInd w:w="675" w:type="dxa"/>
         <w:tblLook w:val="04A0" w:firstRow="1" w:lastRow="0" w:firstColumn="1" w:lastColumn="0" w:noHBand="0" w:noVBand="1"/>
       </w:tblPr>
       <w:tblGrid>
-        <w:gridCol w:w="9229"/>
+        <w:gridCol w:w="8647"/>
       </w:tblGrid>
       <w:tr>
         <w:trPr>
@@ -19513,7 +19513,7 @@
         </w:trPr>
         <w:tc>
           <w:tcPr>
-            <w:tcW w:w="9229" w:type="dxa"/>
+            <w:tcW w:w="8647" w:type="dxa"/>
             <w:tcBorders>
               <w:top w:val="nil"/>
               <w:left w:val="nil"/>
@@ -19555,7 +19555,7 @@
         </w:trPr>
         <w:tc>
           <w:tcPr>
-            <w:tcW w:w="9229" w:type="dxa"/>
+            <w:tcW w:w="8647" w:type="dxa"/>
             <w:tcBorders>
               <w:top w:val="nil"/>
               <w:left w:val="nil"/>
@@ -19597,7 +19597,7 @@
         </w:trPr>
         <w:tc>
           <w:tcPr>
-            <w:tcW w:w="9229" w:type="dxa"/>
+            <w:tcW w:w="8647" w:type="dxa"/>
             <w:tcBorders>
               <w:top w:val="nil"/>
               <w:left w:val="nil"/>
@@ -19639,7 +19639,7 @@
         </w:trPr>
         <w:tc>
           <w:tcPr>
-            <w:tcW w:w="9229" w:type="dxa"/>
+            <w:tcW w:w="8647" w:type="dxa"/>
             <w:tcBorders>
               <w:top w:val="nil"/>
               <w:left w:val="nil"/>
@@ -19691,7 +19691,7 @@
         </w:trPr>
         <w:tc>
           <w:tcPr>
-            <w:tcW w:w="9229" w:type="dxa"/>
+            <w:tcW w:w="8647" w:type="dxa"/>
             <w:tcBorders>
               <w:top w:val="nil"/>
               <w:left w:val="nil"/>
@@ -19773,7 +19773,7 @@
         </w:trPr>
         <w:tc>
           <w:tcPr>
-            <w:tcW w:w="9229" w:type="dxa"/>
+            <w:tcW w:w="8647" w:type="dxa"/>
             <w:tcBorders>
               <w:top w:val="nil"/>
               <w:left w:val="nil"/>
@@ -19805,7 +19805,7 @@
         </w:trPr>
         <w:tc>
           <w:tcPr>
-            <w:tcW w:w="9229" w:type="dxa"/>
+            <w:tcW w:w="8647" w:type="dxa"/>
             <w:tcBorders>
               <w:top w:val="nil"/>
               <w:left w:val="nil"/>
@@ -19847,7 +19847,7 @@
         </w:trPr>
         <w:tc>
           <w:tcPr>
-            <w:tcW w:w="9229" w:type="dxa"/>
+            <w:tcW w:w="8647" w:type="dxa"/>
             <w:tcBorders>
               <w:top w:val="nil"/>
               <w:left w:val="nil"/>
@@ -19889,7 +19889,7 @@
         </w:trPr>
         <w:tc>
           <w:tcPr>
-            <w:tcW w:w="9229" w:type="dxa"/>
+            <w:tcW w:w="8647" w:type="dxa"/>
             <w:tcBorders>
               <w:top w:val="nil"/>
               <w:left w:val="nil"/>
@@ -19942,6 +19942,52 @@
               </w:rPr>
               <w:t xml:space="preserve"> (отсчета паузы окончания пакета)</w:t>
             </w:r>
+          </w:p>
+          <w:p>
+            <w:pPr>
+              <w:spacing w:after="0" w:line="240" w:lineRule="auto"/>
+              <w:rPr>
+                <w:rFonts w:ascii="Times New Roman" w:eastAsia="Times New Roman" w:hAnsi="Times New Roman" w:cs="Times New Roman"/>
+                <w:b/>
+                <w:bCs/>
+                <w:i/>
+                <w:iCs/>
+                <w:color w:val="000000"/>
+                <w:sz w:val="28"/>
+                <w:szCs w:val="28"/>
+                <w:lang w:eastAsia="ru-RU"/>
+              </w:rPr>
+            </w:pPr>
+            <w:r>
+              <w:rPr>
+                <w:rFonts w:ascii="Times New Roman" w:eastAsia="Times New Roman" w:hAnsi="Times New Roman" w:cs="Times New Roman"/>
+                <w:b/>
+                <w:bCs/>
+                <w:i/>
+                <w:iCs/>
+                <w:color w:val="000000"/>
+                <w:sz w:val="28"/>
+                <w:szCs w:val="28"/>
+                <w:lang w:eastAsia="ru-RU"/>
+              </w:rPr>
+              <w:t xml:space="preserve">Таймер2 для </w:t>
+            </w:r>
+            <w:proofErr w:type="spellStart"/>
+            <w:r>
+              <w:rPr>
+                <w:rFonts w:ascii="Times New Roman" w:eastAsia="Times New Roman" w:hAnsi="Times New Roman" w:cs="Times New Roman"/>
+                <w:b/>
+                <w:bCs/>
+                <w:i/>
+                <w:iCs/>
+                <w:color w:val="000000"/>
+                <w:sz w:val="28"/>
+                <w:szCs w:val="28"/>
+                <w:lang w:eastAsia="ru-RU"/>
+              </w:rPr>
+              <w:t>ацп</w:t>
+            </w:r>
+            <w:proofErr w:type="spellEnd"/>
           </w:p>
         </w:tc>
       </w:tr>
@@ -19951,7 +19997,7 @@
         </w:trPr>
         <w:tc>
           <w:tcPr>
-            <w:tcW w:w="9229" w:type="dxa"/>
+            <w:tcW w:w="8647" w:type="dxa"/>
             <w:tcBorders>
               <w:top w:val="nil"/>
               <w:left w:val="nil"/>
@@ -20013,7 +20059,7 @@
         </w:trPr>
         <w:tc>
           <w:tcPr>
-            <w:tcW w:w="9229" w:type="dxa"/>
+            <w:tcW w:w="8647" w:type="dxa"/>
             <w:tcBorders>
               <w:top w:val="nil"/>
               <w:left w:val="nil"/>
@@ -20055,7 +20101,7 @@
         </w:trPr>
         <w:tc>
           <w:tcPr>
-            <w:tcW w:w="9229" w:type="dxa"/>
+            <w:tcW w:w="8647" w:type="dxa"/>
             <w:tcBorders>
               <w:top w:val="nil"/>
               <w:left w:val="nil"/>
@@ -20137,35 +20183,37 @@
         </w:trPr>
         <w:tc>
           <w:tcPr>
-            <w:tcW w:w="9229" w:type="dxa"/>
-            <w:tcBorders>
-              <w:top w:val="nil"/>
-              <w:left w:val="nil"/>
-              <w:bottom w:val="nil"/>
-              <w:right w:val="nil"/>
-            </w:tcBorders>
-            <w:shd w:val="clear" w:color="auto" w:fill="auto"/>
-            <w:noWrap/>
-            <w:vAlign w:val="bottom"/>
-            <w:hideMark/>
-          </w:tcPr>
-          <w:p>
-            <w:pPr>
-              <w:spacing w:after="0" w:line="240" w:lineRule="auto"/>
-              <w:rPr>
-                <w:rFonts w:ascii="Times New Roman" w:eastAsia="Times New Roman" w:hAnsi="Times New Roman" w:cs="Times New Roman"/>
-                <w:color w:val="000000"/>
-                <w:sz w:val="28"/>
-                <w:szCs w:val="28"/>
-                <w:lang w:eastAsia="ru-RU"/>
-              </w:rPr>
-            </w:pPr>
-            <w:r>
-              <w:rPr>
-                <w:rFonts w:ascii="Times New Roman" w:eastAsia="Times New Roman" w:hAnsi="Times New Roman" w:cs="Times New Roman"/>
-                <w:color w:val="000000"/>
-                <w:sz w:val="28"/>
-                <w:szCs w:val="28"/>
+            <w:tcW w:w="8647" w:type="dxa"/>
+            <w:tcBorders>
+              <w:top w:val="nil"/>
+              <w:left w:val="nil"/>
+              <w:bottom w:val="nil"/>
+              <w:right w:val="nil"/>
+            </w:tcBorders>
+            <w:shd w:val="clear" w:color="auto" w:fill="auto"/>
+            <w:noWrap/>
+            <w:vAlign w:val="bottom"/>
+            <w:hideMark/>
+          </w:tcPr>
+          <w:p>
+            <w:pPr>
+              <w:spacing w:after="0" w:line="240" w:lineRule="auto"/>
+              <w:rPr>
+                <w:rFonts w:ascii="Times New Roman" w:eastAsia="Times New Roman" w:hAnsi="Times New Roman" w:cs="Times New Roman"/>
+                <w:color w:val="000000"/>
+                <w:sz w:val="28"/>
+                <w:szCs w:val="28"/>
+                <w:highlight w:val="yellow"/>
+                <w:lang w:eastAsia="ru-RU"/>
+              </w:rPr>
+            </w:pPr>
+            <w:r>
+              <w:rPr>
+                <w:rFonts w:ascii="Times New Roman" w:eastAsia="Times New Roman" w:hAnsi="Times New Roman" w:cs="Times New Roman"/>
+                <w:color w:val="000000"/>
+                <w:sz w:val="28"/>
+                <w:szCs w:val="28"/>
+                <w:highlight w:val="yellow"/>
                 <w:lang w:eastAsia="ru-RU"/>
               </w:rPr>
               <w:t>Определение структуры и инициализация дискретных выходов</w:t>
@@ -20179,35 +20227,37 @@
         </w:trPr>
         <w:tc>
           <w:tcPr>
-            <w:tcW w:w="9229" w:type="dxa"/>
-            <w:tcBorders>
-              <w:top w:val="nil"/>
-              <w:left w:val="nil"/>
-              <w:bottom w:val="nil"/>
-              <w:right w:val="nil"/>
-            </w:tcBorders>
-            <w:shd w:val="clear" w:color="auto" w:fill="auto"/>
-            <w:noWrap/>
-            <w:vAlign w:val="bottom"/>
-            <w:hideMark/>
-          </w:tcPr>
-          <w:p>
-            <w:pPr>
-              <w:spacing w:after="0" w:line="240" w:lineRule="auto"/>
-              <w:rPr>
-                <w:rFonts w:ascii="Times New Roman" w:eastAsia="Times New Roman" w:hAnsi="Times New Roman" w:cs="Times New Roman"/>
-                <w:color w:val="000000"/>
-                <w:sz w:val="28"/>
-                <w:szCs w:val="28"/>
-                <w:lang w:eastAsia="ru-RU"/>
-              </w:rPr>
-            </w:pPr>
-            <w:r>
-              <w:rPr>
-                <w:rFonts w:ascii="Times New Roman" w:eastAsia="Times New Roman" w:hAnsi="Times New Roman" w:cs="Times New Roman"/>
-                <w:color w:val="000000"/>
-                <w:sz w:val="28"/>
-                <w:szCs w:val="28"/>
+            <w:tcW w:w="8647" w:type="dxa"/>
+            <w:tcBorders>
+              <w:top w:val="nil"/>
+              <w:left w:val="nil"/>
+              <w:bottom w:val="nil"/>
+              <w:right w:val="nil"/>
+            </w:tcBorders>
+            <w:shd w:val="clear" w:color="auto" w:fill="auto"/>
+            <w:noWrap/>
+            <w:vAlign w:val="bottom"/>
+            <w:hideMark/>
+          </w:tcPr>
+          <w:p>
+            <w:pPr>
+              <w:spacing w:after="0" w:line="240" w:lineRule="auto"/>
+              <w:rPr>
+                <w:rFonts w:ascii="Times New Roman" w:eastAsia="Times New Roman" w:hAnsi="Times New Roman" w:cs="Times New Roman"/>
+                <w:color w:val="000000"/>
+                <w:sz w:val="28"/>
+                <w:szCs w:val="28"/>
+                <w:highlight w:val="yellow"/>
+                <w:lang w:eastAsia="ru-RU"/>
+              </w:rPr>
+            </w:pPr>
+            <w:r>
+              <w:rPr>
+                <w:rFonts w:ascii="Times New Roman" w:eastAsia="Times New Roman" w:hAnsi="Times New Roman" w:cs="Times New Roman"/>
+                <w:color w:val="000000"/>
+                <w:sz w:val="28"/>
+                <w:szCs w:val="28"/>
+                <w:highlight w:val="yellow"/>
                 <w:lang w:eastAsia="ru-RU"/>
               </w:rPr>
               <w:t>Определение структуры и инициализация дискретных входов</w:t>
@@ -20221,7 +20271,7 @@
         </w:trPr>
         <w:tc>
           <w:tcPr>
-            <w:tcW w:w="9229" w:type="dxa"/>
+            <w:tcW w:w="8647" w:type="dxa"/>
             <w:tcBorders>
               <w:top w:val="nil"/>
               <w:left w:val="nil"/>
@@ -20263,7 +20313,7 @@
         </w:trPr>
         <w:tc>
           <w:tcPr>
-            <w:tcW w:w="9229" w:type="dxa"/>
+            <w:tcW w:w="8647" w:type="dxa"/>
             <w:tcBorders>
               <w:top w:val="nil"/>
               <w:left w:val="nil"/>
@@ -20295,7 +20345,7 @@
         </w:trPr>
         <w:tc>
           <w:tcPr>
-            <w:tcW w:w="9229" w:type="dxa"/>
+            <w:tcW w:w="8647" w:type="dxa"/>
             <w:tcBorders>
               <w:top w:val="nil"/>
               <w:left w:val="nil"/>
@@ -20337,7 +20387,7 @@
         </w:trPr>
         <w:tc>
           <w:tcPr>
-            <w:tcW w:w="9229" w:type="dxa"/>
+            <w:tcW w:w="8647" w:type="dxa"/>
             <w:tcBorders>
               <w:top w:val="nil"/>
               <w:left w:val="nil"/>
@@ -20379,7 +20429,7 @@
         </w:trPr>
         <w:tc>
           <w:tcPr>
-            <w:tcW w:w="9229" w:type="dxa"/>
+            <w:tcW w:w="8647" w:type="dxa"/>
             <w:tcBorders>
               <w:top w:val="nil"/>
               <w:left w:val="nil"/>
@@ -20431,7 +20481,7 @@
         </w:trPr>
         <w:tc>
           <w:tcPr>
-            <w:tcW w:w="9229" w:type="dxa"/>
+            <w:tcW w:w="8647" w:type="dxa"/>
             <w:tcBorders>
               <w:top w:val="nil"/>
               <w:left w:val="nil"/>
@@ -20473,7 +20523,7 @@
         </w:trPr>
         <w:tc>
           <w:tcPr>
-            <w:tcW w:w="9229" w:type="dxa"/>
+            <w:tcW w:w="8647" w:type="dxa"/>
             <w:tcBorders>
               <w:top w:val="nil"/>
               <w:left w:val="nil"/>
@@ -20515,7 +20565,7 @@
         </w:trPr>
         <w:tc>
           <w:tcPr>
-            <w:tcW w:w="9229" w:type="dxa"/>
+            <w:tcW w:w="8647" w:type="dxa"/>
             <w:tcBorders>
               <w:top w:val="nil"/>
               <w:left w:val="nil"/>
@@ -20557,7 +20607,7 @@
         </w:trPr>
         <w:tc>
           <w:tcPr>
-            <w:tcW w:w="9229" w:type="dxa"/>
+            <w:tcW w:w="8647" w:type="dxa"/>
             <w:tcBorders>
               <w:top w:val="nil"/>
               <w:left w:val="nil"/>
@@ -20599,7 +20649,7 @@
         </w:trPr>
         <w:tc>
           <w:tcPr>
-            <w:tcW w:w="9229" w:type="dxa"/>
+            <w:tcW w:w="8647" w:type="dxa"/>
             <w:tcBorders>
               <w:top w:val="nil"/>
               <w:left w:val="nil"/>
@@ -20631,7 +20681,7 @@
         </w:trPr>
         <w:tc>
           <w:tcPr>
-            <w:tcW w:w="9229" w:type="dxa"/>
+            <w:tcW w:w="8647" w:type="dxa"/>
             <w:tcBorders>
               <w:top w:val="nil"/>
               <w:left w:val="nil"/>
@@ -20663,6 +20713,48 @@
                 <w:lang w:eastAsia="ru-RU"/>
               </w:rPr>
               <w:t>Пауза при включении</w:t>
+            </w:r>
+          </w:p>
+        </w:tc>
+      </w:tr>
+      <w:tr>
+        <w:trPr>
+          <w:trHeight w:val="507"/>
+        </w:trPr>
+        <w:tc>
+          <w:tcPr>
+            <w:tcW w:w="8647" w:type="dxa"/>
+            <w:tcBorders>
+              <w:top w:val="nil"/>
+              <w:left w:val="nil"/>
+              <w:bottom w:val="nil"/>
+              <w:right w:val="nil"/>
+            </w:tcBorders>
+            <w:shd w:val="clear" w:color="auto" w:fill="auto"/>
+            <w:noWrap/>
+            <w:vAlign w:val="bottom"/>
+            <w:hideMark/>
+          </w:tcPr>
+          <w:p>
+            <w:pPr>
+              <w:spacing w:after="0" w:line="240" w:lineRule="auto"/>
+              <w:rPr>
+                <w:rFonts w:ascii="Times New Roman" w:eastAsia="Times New Roman" w:hAnsi="Times New Roman" w:cs="Times New Roman"/>
+                <w:color w:val="000000"/>
+                <w:sz w:val="28"/>
+                <w:szCs w:val="28"/>
+                <w:lang w:eastAsia="ru-RU"/>
+              </w:rPr>
+            </w:pPr>
+            <w:r>
+              <w:rPr>
+                <w:rFonts w:ascii="Times New Roman" w:eastAsia="Times New Roman" w:hAnsi="Times New Roman" w:cs="Times New Roman"/>
+                <w:color w:val="000000"/>
+                <w:sz w:val="28"/>
+                <w:szCs w:val="28"/>
+                <w:lang w:eastAsia="ru-RU"/>
+              </w:rPr>
+              <w:t>Задание начального состояния контроллера</w:t>
             </w:r>
           </w:p>
         </w:tc>
@@ -20673,38 +20765,38 @@
         </w:trPr>
         <w:tc>
           <w:tcPr>
-            <w:tcW w:w="9229" w:type="dxa"/>
-            <w:tcBorders>
-              <w:top w:val="nil"/>
-              <w:left w:val="nil"/>
-              <w:bottom w:val="nil"/>
-              <w:right w:val="nil"/>
-            </w:tcBorders>
-            <w:shd w:val="clear" w:color="auto" w:fill="auto"/>
-            <w:noWrap/>
-            <w:vAlign w:val="bottom"/>
-            <w:hideMark/>
-          </w:tcPr>
-          <w:p>
-            <w:pPr>
-              <w:spacing w:after="0" w:line="240" w:lineRule="auto"/>
-              <w:rPr>
-                <w:rFonts w:ascii="Times New Roman" w:eastAsia="Times New Roman" w:hAnsi="Times New Roman" w:cs="Times New Roman"/>
-                <w:color w:val="000000"/>
-                <w:sz w:val="28"/>
-                <w:szCs w:val="28"/>
-                <w:lang w:eastAsia="ru-RU"/>
-              </w:rPr>
-            </w:pPr>
-            <w:r>
-              <w:rPr>
-                <w:rFonts w:ascii="Times New Roman" w:eastAsia="Times New Roman" w:hAnsi="Times New Roman" w:cs="Times New Roman"/>
-                <w:color w:val="000000"/>
-                <w:sz w:val="28"/>
-                <w:szCs w:val="28"/>
-                <w:lang w:eastAsia="ru-RU"/>
-              </w:rPr>
-              <w:t>Задание начального состояния контроллера</w:t>
+            <w:tcW w:w="8647" w:type="dxa"/>
+            <w:tcBorders>
+              <w:top w:val="nil"/>
+              <w:left w:val="nil"/>
+              <w:bottom w:val="nil"/>
+              <w:right w:val="nil"/>
+            </w:tcBorders>
+            <w:shd w:val="clear" w:color="auto" w:fill="auto"/>
+            <w:noWrap/>
+            <w:vAlign w:val="bottom"/>
+            <w:hideMark/>
+          </w:tcPr>
+          <w:p>
+            <w:pPr>
+              <w:spacing w:after="0" w:line="240" w:lineRule="auto"/>
+              <w:rPr>
+                <w:rFonts w:ascii="Times New Roman" w:eastAsia="Times New Roman" w:hAnsi="Times New Roman" w:cs="Times New Roman"/>
+                <w:color w:val="000000"/>
+                <w:sz w:val="28"/>
+                <w:szCs w:val="28"/>
+                <w:lang w:eastAsia="ru-RU"/>
+              </w:rPr>
+            </w:pPr>
+            <w:r>
+              <w:rPr>
+                <w:rFonts w:ascii="Times New Roman" w:eastAsia="Times New Roman" w:hAnsi="Times New Roman" w:cs="Times New Roman"/>
+                <w:color w:val="000000"/>
+                <w:sz w:val="28"/>
+                <w:szCs w:val="28"/>
+                <w:lang w:eastAsia="ru-RU"/>
+              </w:rPr>
+              <w:t>Измерение напряжений ОСН и РЕЗ</w:t>
             </w:r>
           </w:p>
         </w:tc>
@@ -20715,39 +20807,762 @@
         </w:trPr>
         <w:tc>
           <w:tcPr>
-            <w:tcW w:w="9229" w:type="dxa"/>
-            <w:tcBorders>
-              <w:top w:val="nil"/>
-              <w:left w:val="nil"/>
-              <w:bottom w:val="nil"/>
-              <w:right w:val="nil"/>
-            </w:tcBorders>
-            <w:shd w:val="clear" w:color="auto" w:fill="auto"/>
-            <w:noWrap/>
-            <w:vAlign w:val="bottom"/>
-            <w:hideMark/>
-          </w:tcPr>
-          <w:p>
-            <w:pPr>
-              <w:spacing w:after="0" w:line="240" w:lineRule="auto"/>
-              <w:rPr>
-                <w:rFonts w:ascii="Times New Roman" w:eastAsia="Times New Roman" w:hAnsi="Times New Roman" w:cs="Times New Roman"/>
-                <w:color w:val="000000"/>
-                <w:sz w:val="28"/>
-                <w:szCs w:val="28"/>
-                <w:lang w:eastAsia="ru-RU"/>
-              </w:rPr>
-            </w:pPr>
-            <w:r>
-              <w:rPr>
-                <w:rFonts w:ascii="Times New Roman" w:eastAsia="Times New Roman" w:hAnsi="Times New Roman" w:cs="Times New Roman"/>
-                <w:color w:val="000000"/>
-                <w:sz w:val="28"/>
-                <w:szCs w:val="28"/>
-                <w:lang w:eastAsia="ru-RU"/>
-              </w:rPr>
-              <w:t>Измерение напряжений ОСН и РЕЗ</w:t>
-            </w:r>
+            <w:tcW w:w="8647" w:type="dxa"/>
+            <w:tcBorders>
+              <w:top w:val="nil"/>
+              <w:left w:val="nil"/>
+              <w:bottom w:val="nil"/>
+              <w:right w:val="nil"/>
+            </w:tcBorders>
+            <w:shd w:val="clear" w:color="auto" w:fill="auto"/>
+            <w:noWrap/>
+            <w:vAlign w:val="bottom"/>
+            <w:hideMark/>
+          </w:tcPr>
+          <w:p>
+            <w:pPr>
+              <w:spacing w:after="0" w:line="240" w:lineRule="auto"/>
+              <w:rPr>
+                <w:rFonts w:ascii="Times New Roman" w:eastAsia="Times New Roman" w:hAnsi="Times New Roman" w:cs="Times New Roman"/>
+                <w:color w:val="000000"/>
+                <w:sz w:val="28"/>
+                <w:szCs w:val="28"/>
+                <w:lang w:eastAsia="ru-RU"/>
+              </w:rPr>
+            </w:pPr>
+            <w:r>
+              <w:rPr>
+                <w:rFonts w:ascii="Times New Roman" w:eastAsia="Times New Roman" w:hAnsi="Times New Roman" w:cs="Times New Roman"/>
+                <w:color w:val="000000"/>
+                <w:sz w:val="28"/>
+                <w:szCs w:val="28"/>
+                <w:lang w:eastAsia="ru-RU"/>
+              </w:rPr>
+              <w:t>Подача питания ОСН или РЕЗ на КАН</w:t>
+            </w:r>
+          </w:p>
+          <w:p>
+            <w:pPr>
+              <w:pStyle w:val="whitespace-pre-wrap"/>
+              <w:rPr>
+                <w:color w:val="000000"/>
+              </w:rPr>
+            </w:pPr>
+            <w:r>
+              <w:rPr>
+                <w:color w:val="000000"/>
+              </w:rPr>
+              <w:t>Измерение напряжений ОСН и РЕЗ Подача питания ОСН или РЕЗ на КАН</w:t>
+            </w:r>
+          </w:p>
+          <w:p>
+            <w:pPr>
+              <w:pStyle w:val="whitespace-pre-wrap"/>
+              <w:rPr>
+                <w:color w:val="000000"/>
+              </w:rPr>
+            </w:pPr>
+            <w:r>
+              <w:rPr>
+                <w:color w:val="000000"/>
+              </w:rPr>
+              <w:t>после того как я измерил напряжения, что мне делать?</w:t>
+            </w:r>
+          </w:p>
+          <w:p>
+            <w:pPr>
+              <w:pStyle w:val="whitespace-normal"/>
+              <w:rPr>
+                <w:color w:val="000000"/>
+              </w:rPr>
+            </w:pPr>
+            <w:r>
+              <w:rPr>
+                <w:color w:val="000000"/>
+              </w:rPr>
+              <w:t>После измерения напряжений ОСН и РЕЗ вам нужно:</w:t>
+            </w:r>
+          </w:p>
+          <w:p>
+            <w:pPr>
+              <w:pStyle w:val="2"/>
+              <w:rPr>
+                <w:color w:val="000000"/>
+              </w:rPr>
+            </w:pPr>
+            <w:r>
+              <w:rPr>
+                <w:color w:val="000000"/>
+              </w:rPr>
+              <w:t>1. Сравнить с пороговыми значениями</w:t>
+            </w:r>
+          </w:p>
+          <w:p>
+            <w:pPr>
+              <w:pStyle w:val="whitespace-normal"/>
+              <w:rPr>
+                <w:color w:val="000000"/>
+              </w:rPr>
+            </w:pPr>
+            <w:r>
+              <w:rPr>
+                <w:color w:val="000000"/>
+              </w:rPr>
+              <w:t xml:space="preserve">Измеренные напряжения нужно сравнить с заранее установленными порогами </w:t>
+            </w:r>
+            <w:r>
+              <w:rPr>
+                <w:color w:val="000000"/>
+              </w:rPr>
+              <w:lastRenderedPageBreak/>
+              <w:t>(минимально допустимыми уровнями напряжения).</w:t>
+            </w:r>
+          </w:p>
+          <w:p>
+            <w:pPr>
+              <w:pStyle w:val="2"/>
+              <w:rPr>
+                <w:color w:val="000000"/>
+              </w:rPr>
+            </w:pPr>
+            <w:r>
+              <w:rPr>
+                <w:color w:val="000000"/>
+              </w:rPr>
+              <w:t>2. Принять решение о переключении источника питания</w:t>
+            </w:r>
+          </w:p>
+          <w:p>
+            <w:pPr>
+              <w:pStyle w:val="whitespace-normal"/>
+              <w:rPr>
+                <w:color w:val="000000"/>
+              </w:rPr>
+            </w:pPr>
+            <w:r>
+              <w:rPr>
+                <w:rStyle w:val="a6"/>
+                <w:rFonts w:eastAsiaTheme="majorEastAsia"/>
+                <w:color w:val="000000"/>
+              </w:rPr>
+              <w:t>Логика работы:</w:t>
+            </w:r>
+          </w:p>
+          <w:p>
+            <w:pPr>
+              <w:pStyle w:val="whitespace-normal"/>
+              <w:numPr>
+                <w:ilvl w:val="0"/>
+                <w:numId w:val="2"/>
+              </w:numPr>
+              <w:rPr>
+                <w:color w:val="000000"/>
+              </w:rPr>
+            </w:pPr>
+            <w:r>
+              <w:rPr>
+                <w:rStyle w:val="a6"/>
+                <w:rFonts w:eastAsiaTheme="majorEastAsia"/>
+                <w:color w:val="000000"/>
+              </w:rPr>
+              <w:t>Если ОСН (основной) &gt;= порога</w:t>
+            </w:r>
+            <w:r>
+              <w:rPr>
+                <w:rStyle w:val="apple-converted-space"/>
+                <w:color w:val="000000"/>
+              </w:rPr>
+              <w:t> </w:t>
+            </w:r>
+            <w:r>
+              <w:rPr>
+                <w:color w:val="000000"/>
+              </w:rPr>
+              <w:t>→ подавать питание на КАН от ОСН</w:t>
+            </w:r>
+          </w:p>
+          <w:p>
+            <w:pPr>
+              <w:pStyle w:val="whitespace-normal"/>
+              <w:numPr>
+                <w:ilvl w:val="0"/>
+                <w:numId w:val="2"/>
+              </w:numPr>
+              <w:rPr>
+                <w:color w:val="000000"/>
+              </w:rPr>
+            </w:pPr>
+            <w:r>
+              <w:rPr>
+                <w:rStyle w:val="a6"/>
+                <w:rFonts w:eastAsiaTheme="majorEastAsia"/>
+                <w:color w:val="000000"/>
+              </w:rPr>
+              <w:t>Если ОСН &lt; порога И РЕЗ (резервный) &gt;= порога</w:t>
+            </w:r>
+            <w:r>
+              <w:rPr>
+                <w:rStyle w:val="apple-converted-space"/>
+                <w:color w:val="000000"/>
+              </w:rPr>
+              <w:t> </w:t>
+            </w:r>
+            <w:r>
+              <w:rPr>
+                <w:color w:val="000000"/>
+              </w:rPr>
+              <w:t>→ переключиться на РЕЗ, подавать питание на КАН от РЕЗ</w:t>
+            </w:r>
+          </w:p>
+          <w:p>
+            <w:pPr>
+              <w:pStyle w:val="whitespace-normal"/>
+              <w:numPr>
+                <w:ilvl w:val="0"/>
+                <w:numId w:val="2"/>
+              </w:numPr>
+              <w:rPr>
+                <w:color w:val="000000"/>
+              </w:rPr>
+            </w:pPr>
+            <w:r>
+              <w:rPr>
+                <w:rStyle w:val="a6"/>
+                <w:rFonts w:eastAsiaTheme="majorEastAsia"/>
+                <w:color w:val="000000"/>
+              </w:rPr>
+              <w:t>Если оба источника &lt; порога</w:t>
+            </w:r>
+            <w:r>
+              <w:rPr>
+                <w:rStyle w:val="apple-converted-space"/>
+                <w:color w:val="000000"/>
+              </w:rPr>
+              <w:t> </w:t>
+            </w:r>
+            <w:r>
+              <w:rPr>
+                <w:color w:val="000000"/>
+              </w:rPr>
+              <w:t>→ возможно, отключить питание или зафиксировать аварию</w:t>
+            </w:r>
+          </w:p>
+          <w:p>
+            <w:pPr>
+              <w:pStyle w:val="2"/>
+              <w:rPr>
+                <w:color w:val="000000"/>
+              </w:rPr>
+            </w:pPr>
+            <w:r>
+              <w:rPr>
+                <w:color w:val="000000"/>
+              </w:rPr>
+              <w:t>3. Управление реле/ключами</w:t>
+            </w:r>
+          </w:p>
+          <w:p>
+            <w:pPr>
+              <w:pStyle w:val="whitespace-normal"/>
+              <w:rPr>
+                <w:color w:val="000000"/>
+              </w:rPr>
+            </w:pPr>
+            <w:r>
+              <w:rPr>
+                <w:color w:val="000000"/>
+              </w:rPr>
+              <w:t>Для подачи питания используются управляющие выводы:</w:t>
+            </w:r>
+          </w:p>
+          <w:p>
+            <w:pPr>
+              <w:pStyle w:val="whitespace-normal"/>
+              <w:numPr>
+                <w:ilvl w:val="0"/>
+                <w:numId w:val="3"/>
+              </w:numPr>
+              <w:rPr>
+                <w:color w:val="000000"/>
+              </w:rPr>
+            </w:pPr>
+            <w:r>
+              <w:rPr>
+                <w:rStyle w:val="a6"/>
+                <w:rFonts w:eastAsiaTheme="majorEastAsia"/>
+                <w:color w:val="000000"/>
+              </w:rPr>
+              <w:t>K1</w:t>
+            </w:r>
+            <w:r>
+              <w:rPr>
+                <w:rStyle w:val="apple-converted-space"/>
+                <w:color w:val="000000"/>
+              </w:rPr>
+              <w:t> </w:t>
+            </w:r>
+            <w:r>
+              <w:rPr>
+                <w:color w:val="000000"/>
+              </w:rPr>
+              <w:t>(вывод 15) — включить основное питание</w:t>
+            </w:r>
+          </w:p>
+          <w:p>
+            <w:pPr>
+              <w:pStyle w:val="whitespace-normal"/>
+              <w:numPr>
+                <w:ilvl w:val="0"/>
+                <w:numId w:val="3"/>
+              </w:numPr>
+              <w:rPr>
+                <w:color w:val="000000"/>
+              </w:rPr>
+            </w:pPr>
+            <w:r>
+              <w:rPr>
+                <w:rStyle w:val="a6"/>
+                <w:rFonts w:eastAsiaTheme="majorEastAsia"/>
+                <w:color w:val="000000"/>
+              </w:rPr>
+              <w:t>K2</w:t>
+            </w:r>
+            <w:r>
+              <w:rPr>
+                <w:rStyle w:val="apple-converted-space"/>
+                <w:color w:val="000000"/>
+              </w:rPr>
+              <w:t> </w:t>
+            </w:r>
+            <w:r>
+              <w:rPr>
+                <w:color w:val="000000"/>
+              </w:rPr>
+              <w:t>(вывод 14) — включить резервное питание</w:t>
+            </w:r>
+          </w:p>
+          <w:p>
+            <w:pPr>
+              <w:pStyle w:val="whitespace-normal"/>
+              <w:rPr>
+                <w:color w:val="000000"/>
+              </w:rPr>
+            </w:pPr>
+            <w:r>
+              <w:rPr>
+                <w:rStyle w:val="a6"/>
+                <w:rFonts w:eastAsiaTheme="majorEastAsia"/>
+                <w:color w:val="000000"/>
+              </w:rPr>
+              <w:t>Алгоритм:</w:t>
+            </w:r>
+          </w:p>
+          <w:p>
+            <w:pPr>
+              <w:pStyle w:val="HTML"/>
+              <w:spacing w:before="120" w:after="120"/>
+              <w:rPr>
+                <w:rStyle w:val="HTML1"/>
+                <w:rFonts w:ascii="var(--font-mono)" w:hAnsi="var(--font-mono)"/>
+                <w:color w:val="383A42"/>
+              </w:rPr>
+            </w:pPr>
+            <w:r>
+              <w:rPr>
+                <w:rStyle w:val="HTML1"/>
+                <w:rFonts w:ascii="var(--font-mono)" w:hAnsi="var(--font-mono)"/>
+                <w:color w:val="383A42"/>
+              </w:rPr>
+              <w:t xml:space="preserve">если (ОСН &gt;= </w:t>
+            </w:r>
+            <w:proofErr w:type="spellStart"/>
+            <w:r>
+              <w:rPr>
+                <w:rStyle w:val="HTML1"/>
+                <w:rFonts w:ascii="var(--font-mono)" w:hAnsi="var(--font-mono)"/>
+                <w:color w:val="383A42"/>
+              </w:rPr>
+              <w:t>порог_ОСН</w:t>
+            </w:r>
+            <w:proofErr w:type="spellEnd"/>
+            <w:r>
+              <w:rPr>
+                <w:rStyle w:val="HTML1"/>
+                <w:rFonts w:ascii="var(--font-mono)" w:hAnsi="var(--font-mono)"/>
+                <w:color w:val="383A42"/>
+              </w:rPr>
+              <w:t>) {</w:t>
+            </w:r>
+          </w:p>
+          <w:p>
+            <w:pPr>
+              <w:pStyle w:val="HTML"/>
+              <w:spacing w:before="120" w:after="120"/>
+              <w:rPr>
+                <w:rStyle w:val="HTML1"/>
+                <w:rFonts w:ascii="var(--font-mono)" w:hAnsi="var(--font-mono)"/>
+                <w:color w:val="383A42"/>
+              </w:rPr>
+            </w:pPr>
+            <w:r>
+              <w:rPr>
+                <w:rStyle w:val="HTML1"/>
+                <w:rFonts w:ascii="var(--font-mono)" w:hAnsi="var(--font-mono)"/>
+                <w:color w:val="383A42"/>
+              </w:rPr>
+              <w:t xml:space="preserve">    K1 = 1;  // включить основное</w:t>
+            </w:r>
+          </w:p>
+          <w:p>
+            <w:pPr>
+              <w:pStyle w:val="HTML"/>
+              <w:spacing w:before="120" w:after="120"/>
+              <w:rPr>
+                <w:rStyle w:val="HTML1"/>
+                <w:rFonts w:ascii="var(--font-mono)" w:hAnsi="var(--font-mono)"/>
+                <w:color w:val="383A42"/>
+              </w:rPr>
+            </w:pPr>
+            <w:r>
+              <w:rPr>
+                <w:rStyle w:val="HTML1"/>
+                <w:rFonts w:ascii="var(--font-mono)" w:hAnsi="var(--font-mono)"/>
+                <w:color w:val="383A42"/>
+              </w:rPr>
+              <w:t xml:space="preserve">    K2 = 0;  // выключить резервное</w:t>
+            </w:r>
+          </w:p>
+          <w:p>
+            <w:pPr>
+              <w:pStyle w:val="HTML"/>
+              <w:spacing w:before="120" w:after="120"/>
+              <w:rPr>
+                <w:rStyle w:val="HTML1"/>
+                <w:rFonts w:ascii="var(--font-mono)" w:hAnsi="var(--font-mono)"/>
+                <w:color w:val="383A42"/>
+              </w:rPr>
+            </w:pPr>
+            <w:r>
+              <w:rPr>
+                <w:rStyle w:val="HTML1"/>
+                <w:rFonts w:ascii="var(--font-mono)" w:hAnsi="var(--font-mono)"/>
+                <w:color w:val="383A42"/>
+              </w:rPr>
+              <w:t>}</w:t>
+            </w:r>
+          </w:p>
+          <w:p>
+            <w:pPr>
+              <w:pStyle w:val="HTML"/>
+              <w:spacing w:before="120" w:after="120"/>
+              <w:rPr>
+                <w:rStyle w:val="HTML1"/>
+                <w:rFonts w:ascii="var(--font-mono)" w:hAnsi="var(--font-mono)"/>
+                <w:color w:val="383A42"/>
+              </w:rPr>
+            </w:pPr>
+            <w:r>
+              <w:rPr>
+                <w:rStyle w:val="HTML1"/>
+                <w:rFonts w:ascii="var(--font-mono)" w:hAnsi="var(--font-mono)"/>
+                <w:color w:val="383A42"/>
+              </w:rPr>
+              <w:t xml:space="preserve">иначе если (РЕЗ &gt;= </w:t>
+            </w:r>
+            <w:proofErr w:type="spellStart"/>
+            <w:r>
+              <w:rPr>
+                <w:rStyle w:val="HTML1"/>
+                <w:rFonts w:ascii="var(--font-mono)" w:hAnsi="var(--font-mono)"/>
+                <w:color w:val="383A42"/>
+              </w:rPr>
+              <w:t>порог_РЕЗ</w:t>
+            </w:r>
+            <w:proofErr w:type="spellEnd"/>
+            <w:r>
+              <w:rPr>
+                <w:rStyle w:val="HTML1"/>
+                <w:rFonts w:ascii="var(--font-mono)" w:hAnsi="var(--font-mono)"/>
+                <w:color w:val="383A42"/>
+              </w:rPr>
+              <w:t>) {</w:t>
+            </w:r>
+          </w:p>
+          <w:p>
+            <w:pPr>
+              <w:pStyle w:val="HTML"/>
+              <w:spacing w:before="120" w:after="120"/>
+              <w:rPr>
+                <w:rStyle w:val="HTML1"/>
+                <w:rFonts w:ascii="var(--font-mono)" w:hAnsi="var(--font-mono)"/>
+                <w:color w:val="383A42"/>
+              </w:rPr>
+            </w:pPr>
+            <w:r>
+              <w:rPr>
+                <w:rStyle w:val="HTML1"/>
+                <w:rFonts w:ascii="var(--font-mono)" w:hAnsi="var(--font-mono)"/>
+                <w:color w:val="383A42"/>
+              </w:rPr>
+              <w:t xml:space="preserve">    K1 = 0;  // выключить основное</w:t>
+            </w:r>
+          </w:p>
+          <w:p>
+            <w:pPr>
+              <w:pStyle w:val="HTML"/>
+              <w:spacing w:before="120" w:after="120"/>
+              <w:rPr>
+                <w:rStyle w:val="HTML1"/>
+                <w:rFonts w:ascii="var(--font-mono)" w:hAnsi="var(--font-mono)"/>
+                <w:color w:val="383A42"/>
+              </w:rPr>
+            </w:pPr>
+            <w:r>
+              <w:rPr>
+                <w:rStyle w:val="HTML1"/>
+                <w:rFonts w:ascii="var(--font-mono)" w:hAnsi="var(--font-mono)"/>
+                <w:color w:val="383A42"/>
+              </w:rPr>
+              <w:t xml:space="preserve">    K2 = 1;  // включить резервное</w:t>
+            </w:r>
+          </w:p>
+          <w:p>
+            <w:pPr>
+              <w:pStyle w:val="HTML"/>
+              <w:spacing w:before="120" w:after="120"/>
+              <w:rPr>
+                <w:rStyle w:val="HTML1"/>
+                <w:rFonts w:ascii="var(--font-mono)" w:hAnsi="var(--font-mono)"/>
+                <w:color w:val="383A42"/>
+              </w:rPr>
+            </w:pPr>
+            <w:r>
+              <w:rPr>
+                <w:rStyle w:val="HTML1"/>
+                <w:rFonts w:ascii="var(--font-mono)" w:hAnsi="var(--font-mono)"/>
+                <w:color w:val="383A42"/>
+              </w:rPr>
+              <w:t>}</w:t>
+            </w:r>
+          </w:p>
+          <w:p>
+            <w:pPr>
+              <w:pStyle w:val="HTML"/>
+              <w:spacing w:before="120" w:after="120"/>
+              <w:rPr>
+                <w:rStyle w:val="HTML1"/>
+                <w:rFonts w:ascii="var(--font-mono)" w:hAnsi="var(--font-mono)"/>
+                <w:color w:val="383A42"/>
+              </w:rPr>
+            </w:pPr>
+            <w:r>
+              <w:rPr>
+                <w:rStyle w:val="HTML1"/>
+                <w:rFonts w:ascii="var(--font-mono)" w:hAnsi="var(--font-mono)"/>
+                <w:color w:val="383A42"/>
+              </w:rPr>
+              <w:t>иначе {</w:t>
+            </w:r>
+          </w:p>
+          <w:p>
+            <w:pPr>
+              <w:pStyle w:val="HTML"/>
+              <w:spacing w:before="120" w:after="120"/>
+              <w:rPr>
+                <w:rStyle w:val="HTML1"/>
+                <w:rFonts w:ascii="var(--font-mono)" w:hAnsi="var(--font-mono)"/>
+                <w:color w:val="383A42"/>
+              </w:rPr>
+            </w:pPr>
+            <w:r>
+              <w:rPr>
+                <w:rStyle w:val="HTML1"/>
+                <w:rFonts w:ascii="var(--font-mono)" w:hAnsi="var(--font-mono)"/>
+                <w:color w:val="383A42"/>
+              </w:rPr>
+              <w:t xml:space="preserve">    // оба источника неисправны</w:t>
+            </w:r>
+          </w:p>
+          <w:p>
+            <w:pPr>
+              <w:pStyle w:val="HTML"/>
+              <w:spacing w:before="120" w:after="120"/>
+              <w:rPr>
+                <w:rStyle w:val="HTML1"/>
+                <w:rFonts w:ascii="var(--font-mono)" w:hAnsi="var(--font-mono)"/>
+                <w:color w:val="383A42"/>
+              </w:rPr>
+            </w:pPr>
+            <w:r>
+              <w:rPr>
+                <w:rStyle w:val="HTML1"/>
+                <w:rFonts w:ascii="var(--font-mono)" w:hAnsi="var(--font-mono)"/>
+                <w:color w:val="383A42"/>
+              </w:rPr>
+              <w:t xml:space="preserve">    K1 = 0;</w:t>
+            </w:r>
+          </w:p>
+          <w:p>
+            <w:pPr>
+              <w:pStyle w:val="HTML"/>
+              <w:spacing w:before="120" w:after="120"/>
+              <w:rPr>
+                <w:rStyle w:val="HTML1"/>
+                <w:rFonts w:ascii="var(--font-mono)" w:hAnsi="var(--font-mono)"/>
+                <w:color w:val="383A42"/>
+              </w:rPr>
+            </w:pPr>
+            <w:r>
+              <w:rPr>
+                <w:rStyle w:val="HTML1"/>
+                <w:rFonts w:ascii="var(--font-mono)" w:hAnsi="var(--font-mono)"/>
+                <w:color w:val="383A42"/>
+              </w:rPr>
+              <w:t xml:space="preserve">    K2 = 0;</w:t>
+            </w:r>
+          </w:p>
+          <w:p>
+            <w:pPr>
+              <w:pStyle w:val="HTML"/>
+              <w:spacing w:before="120" w:after="120"/>
+              <w:rPr>
+                <w:rFonts w:ascii="var(--font-mono)" w:hAnsi="var(--font-mono)"/>
+                <w:color w:val="383A42"/>
+              </w:rPr>
+            </w:pPr>
+            <w:r>
+              <w:rPr>
+                <w:rStyle w:val="HTML1"/>
+                <w:rFonts w:ascii="var(--font-mono)" w:hAnsi="var(--font-mono)"/>
+                <w:color w:val="383A42"/>
+              </w:rPr>
+              <w:t>}</w:t>
+            </w:r>
+          </w:p>
+          <w:p>
+            <w:pPr>
+              <w:pStyle w:val="2"/>
+              <w:rPr>
+                <w:rFonts w:ascii="Times New Roman" w:hAnsi="Times New Roman"/>
+                <w:color w:val="000000"/>
+              </w:rPr>
+            </w:pPr>
+            <w:r>
+              <w:rPr>
+                <w:color w:val="000000"/>
+              </w:rPr>
+              <w:t>4. Индикация состояния</w:t>
+            </w:r>
+          </w:p>
+          <w:p>
+            <w:pPr>
+              <w:pStyle w:val="whitespace-normal"/>
+              <w:rPr>
+                <w:color w:val="000000"/>
+              </w:rPr>
+            </w:pPr>
+            <w:r>
+              <w:rPr>
+                <w:color w:val="000000"/>
+              </w:rPr>
+              <w:t>Управлять лампами для визуальной индикации:</w:t>
+            </w:r>
+          </w:p>
+          <w:p>
+            <w:pPr>
+              <w:pStyle w:val="whitespace-normal"/>
+              <w:numPr>
+                <w:ilvl w:val="0"/>
+                <w:numId w:val="4"/>
+              </w:numPr>
+              <w:rPr>
+                <w:color w:val="000000"/>
+              </w:rPr>
+            </w:pPr>
+            <w:proofErr w:type="spellStart"/>
+            <w:r>
+              <w:rPr>
+                <w:rStyle w:val="a6"/>
+                <w:rFonts w:eastAsiaTheme="majorEastAsia"/>
+                <w:color w:val="000000"/>
+              </w:rPr>
+              <w:t>Hlosn</w:t>
+            </w:r>
+            <w:proofErr w:type="spellEnd"/>
+            <w:r>
+              <w:rPr>
+                <w:rStyle w:val="apple-converted-space"/>
+                <w:color w:val="000000"/>
+              </w:rPr>
+              <w:t> </w:t>
+            </w:r>
+            <w:r>
+              <w:rPr>
+                <w:color w:val="000000"/>
+              </w:rPr>
+              <w:t>(вывод 31) — лампа ОСН (горит, когда работает основной источник)</w:t>
+            </w:r>
+          </w:p>
+          <w:p>
+            <w:pPr>
+              <w:pStyle w:val="whitespace-normal"/>
+              <w:numPr>
+                <w:ilvl w:val="0"/>
+                <w:numId w:val="4"/>
+              </w:numPr>
+              <w:rPr>
+                <w:color w:val="000000"/>
+              </w:rPr>
+            </w:pPr>
+            <w:proofErr w:type="spellStart"/>
+            <w:r>
+              <w:rPr>
+                <w:rStyle w:val="a6"/>
+                <w:rFonts w:eastAsiaTheme="majorEastAsia"/>
+                <w:color w:val="000000"/>
+              </w:rPr>
+              <w:t>Hlrez</w:t>
+            </w:r>
+            <w:proofErr w:type="spellEnd"/>
+            <w:r>
+              <w:rPr>
+                <w:rStyle w:val="apple-converted-space"/>
+                <w:color w:val="000000"/>
+              </w:rPr>
+              <w:t> </w:t>
+            </w:r>
+            <w:r>
+              <w:rPr>
+                <w:color w:val="000000"/>
+              </w:rPr>
+              <w:t>(вывод 32) — лампа РЕЗ (горит, когда работает резервный источник)</w:t>
+            </w:r>
+          </w:p>
+          <w:p>
+            <w:pPr>
+              <w:pStyle w:val="whitespace-normal"/>
+              <w:rPr>
+                <w:color w:val="000000"/>
+              </w:rPr>
+            </w:pPr>
+            <w:r>
+              <w:rPr>
+                <w:color w:val="000000"/>
+              </w:rPr>
+              <w:t>Это обеспечивает автоматическое резервирование питания КАН.</w:t>
+            </w:r>
+          </w:p>
+          <w:p>
+            <w:pPr>
+              <w:spacing w:after="0" w:line="240" w:lineRule="auto"/>
+              <w:rPr>
+                <w:rFonts w:ascii="Times New Roman" w:eastAsia="Times New Roman" w:hAnsi="Times New Roman" w:cs="Times New Roman"/>
+                <w:color w:val="000000"/>
+                <w:sz w:val="28"/>
+                <w:szCs w:val="28"/>
+                <w:lang w:eastAsia="ru-RU"/>
+              </w:rPr>
+            </w:pPr>
           </w:p>
         </w:tc>
       </w:tr>
@@ -20757,39 +21572,29 @@
         </w:trPr>
         <w:tc>
           <w:tcPr>
-            <w:tcW w:w="9229" w:type="dxa"/>
-            <w:tcBorders>
-              <w:top w:val="nil"/>
-              <w:left w:val="nil"/>
-              <w:bottom w:val="nil"/>
-              <w:right w:val="nil"/>
-            </w:tcBorders>
-            <w:shd w:val="clear" w:color="auto" w:fill="auto"/>
-            <w:noWrap/>
-            <w:vAlign w:val="bottom"/>
-            <w:hideMark/>
-          </w:tcPr>
-          <w:p>
-            <w:pPr>
-              <w:spacing w:after="0" w:line="240" w:lineRule="auto"/>
-              <w:rPr>
-                <w:rFonts w:ascii="Times New Roman" w:eastAsia="Times New Roman" w:hAnsi="Times New Roman" w:cs="Times New Roman"/>
-                <w:color w:val="000000"/>
-                <w:sz w:val="28"/>
-                <w:szCs w:val="28"/>
-                <w:lang w:eastAsia="ru-RU"/>
-              </w:rPr>
-            </w:pPr>
-            <w:r>
-              <w:rPr>
-                <w:rFonts w:ascii="Times New Roman" w:eastAsia="Times New Roman" w:hAnsi="Times New Roman" w:cs="Times New Roman"/>
-                <w:color w:val="000000"/>
-                <w:sz w:val="28"/>
-                <w:szCs w:val="28"/>
-                <w:lang w:eastAsia="ru-RU"/>
-              </w:rPr>
-              <w:t>Подача питания ОСН или РЕЗ на КАН</w:t>
-            </w:r>
+            <w:tcW w:w="8647" w:type="dxa"/>
+            <w:tcBorders>
+              <w:top w:val="nil"/>
+              <w:left w:val="nil"/>
+              <w:bottom w:val="nil"/>
+              <w:right w:val="nil"/>
+            </w:tcBorders>
+            <w:shd w:val="clear" w:color="auto" w:fill="auto"/>
+            <w:noWrap/>
+            <w:vAlign w:val="bottom"/>
+            <w:hideMark/>
+          </w:tcPr>
+          <w:p>
+            <w:pPr>
+              <w:spacing w:after="0" w:line="240" w:lineRule="auto"/>
+              <w:rPr>
+                <w:rFonts w:ascii="Times New Roman" w:eastAsia="Times New Roman" w:hAnsi="Times New Roman" w:cs="Times New Roman"/>
+                <w:color w:val="000000"/>
+                <w:sz w:val="28"/>
+                <w:szCs w:val="28"/>
+                <w:lang w:eastAsia="ru-RU"/>
+              </w:rPr>
+            </w:pPr>
           </w:p>
         </w:tc>
       </w:tr>
@@ -20799,29 +21604,41 @@
         </w:trPr>
         <w:tc>
           <w:tcPr>
-            <w:tcW w:w="9229" w:type="dxa"/>
-            <w:tcBorders>
-              <w:top w:val="nil"/>
-              <w:left w:val="nil"/>
-              <w:bottom w:val="nil"/>
-              <w:right w:val="nil"/>
-            </w:tcBorders>
-            <w:shd w:val="clear" w:color="auto" w:fill="auto"/>
-            <w:noWrap/>
-            <w:vAlign w:val="bottom"/>
-            <w:hideMark/>
-          </w:tcPr>
-          <w:p>
-            <w:pPr>
-              <w:spacing w:after="0" w:line="240" w:lineRule="auto"/>
-              <w:rPr>
-                <w:rFonts w:ascii="Times New Roman" w:eastAsia="Times New Roman" w:hAnsi="Times New Roman" w:cs="Times New Roman"/>
-                <w:color w:val="000000"/>
-                <w:sz w:val="28"/>
-                <w:szCs w:val="28"/>
-                <w:lang w:eastAsia="ru-RU"/>
-              </w:rPr>
-            </w:pPr>
+            <w:tcW w:w="8647" w:type="dxa"/>
+            <w:tcBorders>
+              <w:top w:val="nil"/>
+              <w:left w:val="nil"/>
+              <w:bottom w:val="nil"/>
+              <w:right w:val="nil"/>
+            </w:tcBorders>
+            <w:shd w:val="clear" w:color="auto" w:fill="auto"/>
+            <w:noWrap/>
+            <w:vAlign w:val="bottom"/>
+            <w:hideMark/>
+          </w:tcPr>
+          <w:p>
+            <w:pPr>
+              <w:spacing w:after="0" w:line="240" w:lineRule="auto"/>
+              <w:rPr>
+                <w:rFonts w:ascii="Times New Roman" w:eastAsia="Times New Roman" w:hAnsi="Times New Roman" w:cs="Times New Roman"/>
+                <w:b/>
+                <w:color w:val="000000"/>
+                <w:sz w:val="28"/>
+                <w:szCs w:val="28"/>
+                <w:lang w:eastAsia="ru-RU"/>
+              </w:rPr>
+            </w:pPr>
+            <w:r>
+              <w:rPr>
+                <w:rFonts w:ascii="Times New Roman" w:eastAsia="Times New Roman" w:hAnsi="Times New Roman" w:cs="Times New Roman"/>
+                <w:b/>
+                <w:color w:val="000000"/>
+                <w:sz w:val="28"/>
+                <w:szCs w:val="28"/>
+                <w:lang w:eastAsia="ru-RU"/>
+              </w:rPr>
+              <w:t>Основной рабочий цикл</w:t>
+            </w:r>
           </w:p>
         </w:tc>
       </w:tr>
@@ -20831,7 +21648,7 @@
         </w:trPr>
         <w:tc>
           <w:tcPr>
-            <w:tcW w:w="9229" w:type="dxa"/>
+            <w:tcW w:w="8647" w:type="dxa"/>
             <w:tcBorders>
               <w:top w:val="nil"/>
               <w:left w:val="nil"/>
@@ -20855,17 +21672,6 @@
                 <w:lang w:eastAsia="ru-RU"/>
               </w:rPr>
             </w:pPr>
-            <w:r>
-              <w:rPr>
-                <w:rFonts w:ascii="Times New Roman" w:eastAsia="Times New Roman" w:hAnsi="Times New Roman" w:cs="Times New Roman"/>
-                <w:b/>
-                <w:color w:val="000000"/>
-                <w:sz w:val="28"/>
-                <w:szCs w:val="28"/>
-                <w:lang w:eastAsia="ru-RU"/>
-              </w:rPr>
-              <w:t>Основной рабочий цикл</w:t>
-            </w:r>
           </w:p>
         </w:tc>
       </w:tr>
@@ -20875,7 +21681,7 @@
         </w:trPr>
         <w:tc>
           <w:tcPr>
-            <w:tcW w:w="9229" w:type="dxa"/>
+            <w:tcW w:w="8647" w:type="dxa"/>
             <w:tcBorders>
               <w:top w:val="nil"/>
               <w:left w:val="nil"/>
@@ -20899,6 +21705,52 @@
                 <w:lang w:eastAsia="ru-RU"/>
               </w:rPr>
             </w:pPr>
+            <w:r>
+              <w:rPr>
+                <w:rFonts w:ascii="Times New Roman" w:eastAsia="Times New Roman" w:hAnsi="Times New Roman" w:cs="Times New Roman"/>
+                <w:b/>
+                <w:color w:val="000000"/>
+                <w:sz w:val="28"/>
+                <w:szCs w:val="28"/>
+                <w:lang w:eastAsia="ru-RU"/>
+              </w:rPr>
+              <w:t>Ожидание пакета от ЦПКУ</w:t>
+            </w:r>
+          </w:p>
+          <w:p>
+            <w:pPr>
+              <w:spacing w:after="0" w:line="240" w:lineRule="auto"/>
+              <w:rPr>
+                <w:rFonts w:ascii="Times New Roman" w:eastAsia="Times New Roman" w:hAnsi="Times New Roman" w:cs="Times New Roman"/>
+                <w:b/>
+                <w:color w:val="000000"/>
+                <w:sz w:val="28"/>
+                <w:szCs w:val="28"/>
+                <w:lang w:eastAsia="ru-RU"/>
+              </w:rPr>
+            </w:pPr>
+          </w:p>
+          <w:p>
+            <w:pPr>
+              <w:spacing w:after="0" w:line="240" w:lineRule="auto"/>
+              <w:rPr>
+                <w:rFonts w:ascii="Times New Roman" w:eastAsia="Times New Roman" w:hAnsi="Times New Roman" w:cs="Times New Roman"/>
+                <w:color w:val="000000"/>
+                <w:sz w:val="28"/>
+                <w:szCs w:val="28"/>
+                <w:lang w:eastAsia="ru-RU"/>
+              </w:rPr>
+            </w:pPr>
+            <w:r>
+              <w:rPr>
+                <w:rFonts w:ascii="Times New Roman" w:eastAsia="Times New Roman" w:hAnsi="Times New Roman" w:cs="Times New Roman"/>
+                <w:color w:val="000000"/>
+                <w:sz w:val="28"/>
+                <w:szCs w:val="28"/>
+                <w:lang w:eastAsia="ru-RU"/>
+              </w:rPr>
+              <w:t>АЦП (периодически) - Измерение напряжений ОСН и РЕЗ ,</w:t>
+            </w:r>
           </w:p>
         </w:tc>
       </w:tr>
@@ -20908,75 +21760,38 @@
         </w:trPr>
         <w:tc>
           <w:tcPr>
-            <w:tcW w:w="9229" w:type="dxa"/>
-            <w:tcBorders>
-              <w:top w:val="nil"/>
-              <w:left w:val="nil"/>
-              <w:bottom w:val="nil"/>
-              <w:right w:val="nil"/>
-            </w:tcBorders>
-            <w:shd w:val="clear" w:color="auto" w:fill="auto"/>
-            <w:noWrap/>
-            <w:vAlign w:val="bottom"/>
-            <w:hideMark/>
-          </w:tcPr>
-          <w:p>
-            <w:pPr>
-              <w:spacing w:after="0" w:line="240" w:lineRule="auto"/>
-              <w:rPr>
-                <w:rFonts w:ascii="Times New Roman" w:eastAsia="Times New Roman" w:hAnsi="Times New Roman" w:cs="Times New Roman"/>
-                <w:b/>
-                <w:color w:val="000000"/>
-                <w:sz w:val="28"/>
-                <w:szCs w:val="28"/>
-                <w:lang w:eastAsia="ru-RU"/>
-              </w:rPr>
-            </w:pPr>
-            <w:r>
-              <w:rPr>
-                <w:rFonts w:ascii="Times New Roman" w:eastAsia="Times New Roman" w:hAnsi="Times New Roman" w:cs="Times New Roman"/>
-                <w:b/>
-                <w:color w:val="000000"/>
-                <w:sz w:val="28"/>
-                <w:szCs w:val="28"/>
-                <w:lang w:eastAsia="ru-RU"/>
-              </w:rPr>
-              <w:t>Ожидание пакета от ЦПКУ</w:t>
-            </w:r>
-          </w:p>
-          <w:p>
-            <w:pPr>
-              <w:spacing w:after="0" w:line="240" w:lineRule="auto"/>
-              <w:rPr>
-                <w:rFonts w:ascii="Times New Roman" w:eastAsia="Times New Roman" w:hAnsi="Times New Roman" w:cs="Times New Roman"/>
-                <w:b/>
-                <w:color w:val="000000"/>
-                <w:sz w:val="28"/>
-                <w:szCs w:val="28"/>
-                <w:lang w:eastAsia="ru-RU"/>
-              </w:rPr>
-            </w:pPr>
-          </w:p>
-          <w:p>
-            <w:pPr>
-              <w:spacing w:after="0" w:line="240" w:lineRule="auto"/>
-              <w:rPr>
-                <w:rFonts w:ascii="Times New Roman" w:eastAsia="Times New Roman" w:hAnsi="Times New Roman" w:cs="Times New Roman"/>
-                <w:color w:val="000000"/>
-                <w:sz w:val="28"/>
-                <w:szCs w:val="28"/>
-                <w:lang w:eastAsia="ru-RU"/>
-              </w:rPr>
-            </w:pPr>
-            <w:r>
-              <w:rPr>
-                <w:rFonts w:ascii="Times New Roman" w:eastAsia="Times New Roman" w:hAnsi="Times New Roman" w:cs="Times New Roman"/>
-                <w:color w:val="000000"/>
-                <w:sz w:val="28"/>
-                <w:szCs w:val="28"/>
-                <w:lang w:eastAsia="ru-RU"/>
-              </w:rPr>
-              <w:t>АЦП (периодически) - Измерение напряжений ОСН и РЕЗ ,</w:t>
+            <w:tcW w:w="8647" w:type="dxa"/>
+            <w:tcBorders>
+              <w:top w:val="nil"/>
+              <w:left w:val="nil"/>
+              <w:bottom w:val="nil"/>
+              <w:right w:val="nil"/>
+            </w:tcBorders>
+            <w:shd w:val="clear" w:color="auto" w:fill="auto"/>
+            <w:noWrap/>
+            <w:vAlign w:val="bottom"/>
+            <w:hideMark/>
+          </w:tcPr>
+          <w:p>
+            <w:pPr>
+              <w:spacing w:after="0" w:line="240" w:lineRule="auto"/>
+              <w:rPr>
+                <w:rFonts w:ascii="Times New Roman" w:eastAsia="Times New Roman" w:hAnsi="Times New Roman" w:cs="Times New Roman"/>
+                <w:color w:val="000000"/>
+                <w:sz w:val="28"/>
+                <w:szCs w:val="28"/>
+                <w:lang w:eastAsia="ru-RU"/>
+              </w:rPr>
+            </w:pPr>
+            <w:r>
+              <w:rPr>
+                <w:rFonts w:ascii="Times New Roman" w:eastAsia="Times New Roman" w:hAnsi="Times New Roman" w:cs="Times New Roman"/>
+                <w:color w:val="000000"/>
+                <w:sz w:val="28"/>
+                <w:szCs w:val="28"/>
+                <w:lang w:eastAsia="ru-RU"/>
+              </w:rPr>
+              <w:t xml:space="preserve"> измерение напряжения "+" и "-" на нагрузке</w:t>
             </w:r>
           </w:p>
         </w:tc>
@@ -20987,38 +21802,38 @@
         </w:trPr>
         <w:tc>
           <w:tcPr>
-            <w:tcW w:w="9229" w:type="dxa"/>
-            <w:tcBorders>
-              <w:top w:val="nil"/>
-              <w:left w:val="nil"/>
-              <w:bottom w:val="nil"/>
-              <w:right w:val="nil"/>
-            </w:tcBorders>
-            <w:shd w:val="clear" w:color="auto" w:fill="auto"/>
-            <w:noWrap/>
-            <w:vAlign w:val="bottom"/>
-            <w:hideMark/>
-          </w:tcPr>
-          <w:p>
-            <w:pPr>
-              <w:spacing w:after="0" w:line="240" w:lineRule="auto"/>
-              <w:rPr>
-                <w:rFonts w:ascii="Times New Roman" w:eastAsia="Times New Roman" w:hAnsi="Times New Roman" w:cs="Times New Roman"/>
-                <w:color w:val="000000"/>
-                <w:sz w:val="28"/>
-                <w:szCs w:val="28"/>
-                <w:lang w:eastAsia="ru-RU"/>
-              </w:rPr>
-            </w:pPr>
-            <w:r>
-              <w:rPr>
-                <w:rFonts w:ascii="Times New Roman" w:eastAsia="Times New Roman" w:hAnsi="Times New Roman" w:cs="Times New Roman"/>
-                <w:color w:val="000000"/>
-                <w:sz w:val="28"/>
-                <w:szCs w:val="28"/>
-                <w:lang w:eastAsia="ru-RU"/>
-              </w:rPr>
-              <w:t xml:space="preserve"> измерение напряжения "+" и "-" на нагрузке</w:t>
+            <w:tcW w:w="8647" w:type="dxa"/>
+            <w:tcBorders>
+              <w:top w:val="nil"/>
+              <w:left w:val="nil"/>
+              <w:bottom w:val="nil"/>
+              <w:right w:val="nil"/>
+            </w:tcBorders>
+            <w:shd w:val="clear" w:color="auto" w:fill="auto"/>
+            <w:noWrap/>
+            <w:vAlign w:val="bottom"/>
+            <w:hideMark/>
+          </w:tcPr>
+          <w:p>
+            <w:pPr>
+              <w:spacing w:after="0" w:line="240" w:lineRule="auto"/>
+              <w:rPr>
+                <w:rFonts w:ascii="Times New Roman" w:eastAsia="Times New Roman" w:hAnsi="Times New Roman" w:cs="Times New Roman"/>
+                <w:color w:val="000000"/>
+                <w:sz w:val="28"/>
+                <w:szCs w:val="28"/>
+                <w:lang w:eastAsia="ru-RU"/>
+              </w:rPr>
+            </w:pPr>
+            <w:r>
+              <w:rPr>
+                <w:rFonts w:ascii="Times New Roman" w:eastAsia="Times New Roman" w:hAnsi="Times New Roman" w:cs="Times New Roman"/>
+                <w:color w:val="000000"/>
+                <w:sz w:val="28"/>
+                <w:szCs w:val="28"/>
+                <w:lang w:eastAsia="ru-RU"/>
+              </w:rPr>
+              <w:t>По порогам ОСН и РЕЗ переключение подачи питания.</w:t>
             </w:r>
           </w:p>
         </w:tc>
@@ -21029,38 +21844,38 @@
         </w:trPr>
         <w:tc>
           <w:tcPr>
-            <w:tcW w:w="9229" w:type="dxa"/>
-            <w:tcBorders>
-              <w:top w:val="nil"/>
-              <w:left w:val="nil"/>
-              <w:bottom w:val="nil"/>
-              <w:right w:val="nil"/>
-            </w:tcBorders>
-            <w:shd w:val="clear" w:color="auto" w:fill="auto"/>
-            <w:noWrap/>
-            <w:vAlign w:val="bottom"/>
-            <w:hideMark/>
-          </w:tcPr>
-          <w:p>
-            <w:pPr>
-              <w:spacing w:after="0" w:line="240" w:lineRule="auto"/>
-              <w:rPr>
-                <w:rFonts w:ascii="Times New Roman" w:eastAsia="Times New Roman" w:hAnsi="Times New Roman" w:cs="Times New Roman"/>
-                <w:color w:val="000000"/>
-                <w:sz w:val="28"/>
-                <w:szCs w:val="28"/>
-                <w:lang w:eastAsia="ru-RU"/>
-              </w:rPr>
-            </w:pPr>
-            <w:r>
-              <w:rPr>
-                <w:rFonts w:ascii="Times New Roman" w:eastAsia="Times New Roman" w:hAnsi="Times New Roman" w:cs="Times New Roman"/>
-                <w:color w:val="000000"/>
-                <w:sz w:val="28"/>
-                <w:szCs w:val="28"/>
-                <w:lang w:eastAsia="ru-RU"/>
-              </w:rPr>
-              <w:t>По порогам ОСН и РЕЗ переключение подачи питания.</w:t>
+            <w:tcW w:w="8647" w:type="dxa"/>
+            <w:tcBorders>
+              <w:top w:val="nil"/>
+              <w:left w:val="nil"/>
+              <w:bottom w:val="nil"/>
+              <w:right w:val="nil"/>
+            </w:tcBorders>
+            <w:shd w:val="clear" w:color="auto" w:fill="auto"/>
+            <w:noWrap/>
+            <w:vAlign w:val="bottom"/>
+            <w:hideMark/>
+          </w:tcPr>
+          <w:p>
+            <w:pPr>
+              <w:spacing w:after="0" w:line="240" w:lineRule="auto"/>
+              <w:rPr>
+                <w:rFonts w:ascii="Times New Roman" w:eastAsia="Times New Roman" w:hAnsi="Times New Roman" w:cs="Times New Roman"/>
+                <w:color w:val="000000"/>
+                <w:sz w:val="28"/>
+                <w:szCs w:val="28"/>
+                <w:lang w:eastAsia="ru-RU"/>
+              </w:rPr>
+            </w:pPr>
+            <w:r>
+              <w:rPr>
+                <w:rFonts w:ascii="Times New Roman" w:eastAsia="Times New Roman" w:hAnsi="Times New Roman" w:cs="Times New Roman"/>
+                <w:color w:val="000000"/>
+                <w:sz w:val="28"/>
+                <w:szCs w:val="28"/>
+                <w:lang w:eastAsia="ru-RU"/>
+              </w:rPr>
+              <w:t>Проверка ручного управления</w:t>
             </w:r>
           </w:p>
         </w:tc>
@@ -21071,39 +21886,29 @@
         </w:trPr>
         <w:tc>
           <w:tcPr>
-            <w:tcW w:w="9229" w:type="dxa"/>
-            <w:tcBorders>
-              <w:top w:val="nil"/>
-              <w:left w:val="nil"/>
-              <w:bottom w:val="nil"/>
-              <w:right w:val="nil"/>
-            </w:tcBorders>
-            <w:shd w:val="clear" w:color="auto" w:fill="auto"/>
-            <w:noWrap/>
-            <w:vAlign w:val="bottom"/>
-            <w:hideMark/>
-          </w:tcPr>
-          <w:p>
-            <w:pPr>
-              <w:spacing w:after="0" w:line="240" w:lineRule="auto"/>
-              <w:rPr>
-                <w:rFonts w:ascii="Times New Roman" w:eastAsia="Times New Roman" w:hAnsi="Times New Roman" w:cs="Times New Roman"/>
-                <w:color w:val="000000"/>
-                <w:sz w:val="28"/>
-                <w:szCs w:val="28"/>
-                <w:lang w:eastAsia="ru-RU"/>
-              </w:rPr>
-            </w:pPr>
-            <w:r>
-              <w:rPr>
-                <w:rFonts w:ascii="Times New Roman" w:eastAsia="Times New Roman" w:hAnsi="Times New Roman" w:cs="Times New Roman"/>
-                <w:color w:val="000000"/>
-                <w:sz w:val="28"/>
-                <w:szCs w:val="28"/>
-                <w:lang w:eastAsia="ru-RU"/>
-              </w:rPr>
-              <w:t>Проверка ручного управления</w:t>
-            </w:r>
+            <w:tcW w:w="8647" w:type="dxa"/>
+            <w:tcBorders>
+              <w:top w:val="nil"/>
+              <w:left w:val="nil"/>
+              <w:bottom w:val="nil"/>
+              <w:right w:val="nil"/>
+            </w:tcBorders>
+            <w:shd w:val="clear" w:color="auto" w:fill="auto"/>
+            <w:noWrap/>
+            <w:vAlign w:val="bottom"/>
+            <w:hideMark/>
+          </w:tcPr>
+          <w:p>
+            <w:pPr>
+              <w:spacing w:after="0" w:line="240" w:lineRule="auto"/>
+              <w:rPr>
+                <w:rFonts w:ascii="Times New Roman" w:eastAsia="Times New Roman" w:hAnsi="Times New Roman" w:cs="Times New Roman"/>
+                <w:color w:val="000000"/>
+                <w:sz w:val="28"/>
+                <w:szCs w:val="28"/>
+                <w:lang w:eastAsia="ru-RU"/>
+              </w:rPr>
+            </w:pPr>
           </w:p>
         </w:tc>
       </w:tr>
@@ -21113,29 +21918,39 @@
         </w:trPr>
         <w:tc>
           <w:tcPr>
-            <w:tcW w:w="9229" w:type="dxa"/>
-            <w:tcBorders>
-              <w:top w:val="nil"/>
-              <w:left w:val="nil"/>
-              <w:bottom w:val="nil"/>
-              <w:right w:val="nil"/>
-            </w:tcBorders>
-            <w:shd w:val="clear" w:color="auto" w:fill="auto"/>
-            <w:noWrap/>
-            <w:vAlign w:val="bottom"/>
-            <w:hideMark/>
-          </w:tcPr>
-          <w:p>
-            <w:pPr>
-              <w:spacing w:after="0" w:line="240" w:lineRule="auto"/>
-              <w:rPr>
-                <w:rFonts w:ascii="Times New Roman" w:eastAsia="Times New Roman" w:hAnsi="Times New Roman" w:cs="Times New Roman"/>
-                <w:color w:val="000000"/>
-                <w:sz w:val="28"/>
-                <w:szCs w:val="28"/>
-                <w:lang w:eastAsia="ru-RU"/>
-              </w:rPr>
-            </w:pPr>
+            <w:tcW w:w="8647" w:type="dxa"/>
+            <w:tcBorders>
+              <w:top w:val="nil"/>
+              <w:left w:val="nil"/>
+              <w:bottom w:val="nil"/>
+              <w:right w:val="nil"/>
+            </w:tcBorders>
+            <w:shd w:val="clear" w:color="auto" w:fill="auto"/>
+            <w:noWrap/>
+            <w:vAlign w:val="bottom"/>
+            <w:hideMark/>
+          </w:tcPr>
+          <w:p>
+            <w:pPr>
+              <w:spacing w:after="0" w:line="240" w:lineRule="auto"/>
+              <w:rPr>
+                <w:rFonts w:ascii="Times New Roman" w:eastAsia="Times New Roman" w:hAnsi="Times New Roman" w:cs="Times New Roman"/>
+                <w:color w:val="000000"/>
+                <w:sz w:val="28"/>
+                <w:szCs w:val="28"/>
+                <w:lang w:eastAsia="ru-RU"/>
+              </w:rPr>
+            </w:pPr>
+            <w:r>
+              <w:rPr>
+                <w:rFonts w:ascii="Times New Roman" w:eastAsia="Times New Roman" w:hAnsi="Times New Roman" w:cs="Times New Roman"/>
+                <w:color w:val="000000"/>
+                <w:sz w:val="28"/>
+                <w:szCs w:val="28"/>
+                <w:lang w:eastAsia="ru-RU"/>
+              </w:rPr>
+              <w:t>Проверка признака приема пакета от ЦПКУ</w:t>
+            </w:r>
           </w:p>
         </w:tc>
       </w:tr>
@@ -21145,38 +21960,35 @@
         </w:trPr>
         <w:tc>
           <w:tcPr>
-            <w:tcW w:w="9229" w:type="dxa"/>
-            <w:tcBorders>
-              <w:top w:val="nil"/>
-              <w:left w:val="nil"/>
-              <w:bottom w:val="nil"/>
-              <w:right w:val="nil"/>
-            </w:tcBorders>
-            <w:shd w:val="clear" w:color="auto" w:fill="auto"/>
-            <w:noWrap/>
-            <w:vAlign w:val="bottom"/>
-            <w:hideMark/>
-          </w:tcPr>
-          <w:p>
-            <w:pPr>
-              <w:spacing w:after="0" w:line="240" w:lineRule="auto"/>
-              <w:rPr>
-                <w:rFonts w:ascii="Times New Roman" w:eastAsia="Times New Roman" w:hAnsi="Times New Roman" w:cs="Times New Roman"/>
-                <w:color w:val="000000"/>
-                <w:sz w:val="28"/>
-                <w:szCs w:val="28"/>
-                <w:lang w:eastAsia="ru-RU"/>
-              </w:rPr>
-            </w:pPr>
-            <w:r>
-              <w:rPr>
-                <w:rFonts w:ascii="Times New Roman" w:eastAsia="Times New Roman" w:hAnsi="Times New Roman" w:cs="Times New Roman"/>
-                <w:color w:val="000000"/>
-                <w:sz w:val="28"/>
-                <w:szCs w:val="28"/>
-                <w:lang w:eastAsia="ru-RU"/>
-              </w:rPr>
-              <w:t>Проверка признака приема пакета от ЦПКУ</w:t>
+            <w:tcW w:w="8647" w:type="dxa"/>
+            <w:tcBorders>
+              <w:top w:val="nil"/>
+              <w:left w:val="nil"/>
+              <w:bottom w:val="nil"/>
+              <w:right w:val="nil"/>
+            </w:tcBorders>
+            <w:shd w:val="clear" w:color="auto" w:fill="auto"/>
+            <w:noWrap/>
+            <w:vAlign w:val="bottom"/>
+            <w:hideMark/>
+          </w:tcPr>
+          <w:p>
+            <w:pPr>
+              <w:rPr>
+                <w:rFonts w:ascii="Times New Roman" w:hAnsi="Times New Roman" w:cs="Times New Roman"/>
+                <w:color w:val="000000"/>
+                <w:sz w:val="28"/>
+                <w:szCs w:val="28"/>
+              </w:rPr>
+            </w:pPr>
+            <w:r>
+              <w:rPr>
+                <w:rFonts w:ascii="Times New Roman" w:hAnsi="Times New Roman" w:cs="Times New Roman"/>
+                <w:color w:val="000000"/>
+                <w:sz w:val="28"/>
+                <w:szCs w:val="28"/>
+              </w:rPr>
+              <w:t>Фиксация окончания пакета - по времени паузы 3-4 байта</w:t>
             </w:r>
           </w:p>
         </w:tc>
@@ -21187,36 +21999,79 @@
         </w:trPr>
         <w:tc>
           <w:tcPr>
-            <w:tcW w:w="9229" w:type="dxa"/>
-            <w:tcBorders>
-              <w:top w:val="nil"/>
-              <w:left w:val="nil"/>
-              <w:bottom w:val="nil"/>
-              <w:right w:val="nil"/>
-            </w:tcBorders>
-            <w:shd w:val="clear" w:color="auto" w:fill="auto"/>
-            <w:noWrap/>
-            <w:vAlign w:val="bottom"/>
-            <w:hideMark/>
-          </w:tcPr>
-          <w:p>
-            <w:pPr>
-              <w:rPr>
-                <w:rFonts w:ascii="Times New Roman" w:hAnsi="Times New Roman" w:cs="Times New Roman"/>
-                <w:color w:val="000000"/>
-                <w:sz w:val="28"/>
-                <w:szCs w:val="28"/>
-              </w:rPr>
-            </w:pPr>
-            <w:r>
-              <w:rPr>
-                <w:rFonts w:ascii="Times New Roman" w:hAnsi="Times New Roman" w:cs="Times New Roman"/>
-                <w:color w:val="000000"/>
-                <w:sz w:val="28"/>
-                <w:szCs w:val="28"/>
-              </w:rPr>
-              <w:lastRenderedPageBreak/>
-              <w:t>Фиксация окончания пакета - по времени паузы 3-4 байта</w:t>
+            <w:tcW w:w="8647" w:type="dxa"/>
+            <w:tcBorders>
+              <w:top w:val="nil"/>
+              <w:left w:val="nil"/>
+              <w:bottom w:val="nil"/>
+              <w:right w:val="nil"/>
+            </w:tcBorders>
+            <w:shd w:val="clear" w:color="auto" w:fill="auto"/>
+            <w:noWrap/>
+            <w:vAlign w:val="bottom"/>
+            <w:hideMark/>
+          </w:tcPr>
+          <w:p>
+            <w:pPr>
+              <w:spacing w:after="0" w:line="240" w:lineRule="auto"/>
+              <w:rPr>
+                <w:rFonts w:ascii="Times New Roman" w:eastAsia="Times New Roman" w:hAnsi="Times New Roman" w:cs="Times New Roman"/>
+                <w:color w:val="000000"/>
+                <w:sz w:val="28"/>
+                <w:szCs w:val="28"/>
+                <w:lang w:eastAsia="ru-RU"/>
+              </w:rPr>
+            </w:pPr>
+            <w:r>
+              <w:rPr>
+                <w:rFonts w:ascii="Times New Roman" w:eastAsia="Times New Roman" w:hAnsi="Times New Roman" w:cs="Times New Roman"/>
+                <w:color w:val="000000"/>
+                <w:sz w:val="28"/>
+                <w:szCs w:val="28"/>
+                <w:lang w:eastAsia="ru-RU"/>
+              </w:rPr>
+              <w:t xml:space="preserve">Если </w:t>
+            </w:r>
+            <w:r>
+              <w:rPr>
+                <w:rFonts w:ascii="Times New Roman" w:eastAsia="Times New Roman" w:hAnsi="Times New Roman" w:cs="Times New Roman"/>
+                <w:color w:val="000000"/>
+                <w:sz w:val="28"/>
+                <w:szCs w:val="28"/>
+                <w:lang w:eastAsia="ru-RU"/>
+              </w:rPr>
+              <w:t xml:space="preserve">нет </w:t>
+            </w:r>
+            <w:r>
+              <w:rPr>
+                <w:rFonts w:ascii="Times New Roman" w:eastAsia="Times New Roman" w:hAnsi="Times New Roman" w:cs="Times New Roman"/>
+                <w:color w:val="000000"/>
+                <w:sz w:val="28"/>
+                <w:szCs w:val="28"/>
+                <w:lang w:eastAsia="ru-RU"/>
+              </w:rPr>
+              <w:t>Прием пакета ЦПКУ</w:t>
+            </w:r>
+            <w:r>
+              <w:rPr>
+                <w:rFonts w:ascii="Times New Roman" w:eastAsia="Times New Roman" w:hAnsi="Times New Roman" w:cs="Times New Roman"/>
+                <w:color w:val="000000"/>
+                <w:sz w:val="28"/>
+                <w:szCs w:val="28"/>
+                <w:lang w:eastAsia="ru-RU"/>
+              </w:rPr>
+              <w:t>:</w:t>
+            </w:r>
+            <w:r>
+              <w:rPr>
+                <w:rFonts w:ascii="Times New Roman" w:eastAsia="Times New Roman" w:hAnsi="Times New Roman" w:cs="Times New Roman"/>
+                <w:b/>
+                <w:color w:val="000000"/>
+                <w:sz w:val="28"/>
+                <w:szCs w:val="28"/>
+                <w:lang w:eastAsia="ru-RU"/>
+              </w:rPr>
+              <w:t xml:space="preserve"> Возврат к началу цикла</w:t>
             </w:r>
           </w:p>
         </w:tc>
@@ -21227,48 +22082,60 @@
         </w:trPr>
         <w:tc>
           <w:tcPr>
-            <w:tcW w:w="9229" w:type="dxa"/>
-            <w:tcBorders>
-              <w:top w:val="nil"/>
-              <w:left w:val="nil"/>
-              <w:bottom w:val="nil"/>
-              <w:right w:val="nil"/>
-            </w:tcBorders>
-            <w:shd w:val="clear" w:color="auto" w:fill="auto"/>
-            <w:noWrap/>
-            <w:vAlign w:val="bottom"/>
-            <w:hideMark/>
-          </w:tcPr>
-          <w:p>
-            <w:pPr>
-              <w:spacing w:after="0" w:line="240" w:lineRule="auto"/>
-              <w:rPr>
-                <w:rFonts w:ascii="Times New Roman" w:eastAsia="Times New Roman" w:hAnsi="Times New Roman" w:cs="Times New Roman"/>
-                <w:color w:val="000000"/>
-                <w:sz w:val="28"/>
-                <w:szCs w:val="28"/>
-                <w:lang w:eastAsia="ru-RU"/>
-              </w:rPr>
-            </w:pPr>
-            <w:r>
-              <w:rPr>
-                <w:rFonts w:ascii="Times New Roman" w:eastAsia="Times New Roman" w:hAnsi="Times New Roman" w:cs="Times New Roman"/>
-                <w:color w:val="000000"/>
-                <w:sz w:val="28"/>
-                <w:szCs w:val="28"/>
-                <w:lang w:eastAsia="ru-RU"/>
-              </w:rPr>
-              <w:t xml:space="preserve">Если </w:t>
-            </w:r>
-            <w:r>
-              <w:rPr>
-                <w:rFonts w:ascii="Times New Roman" w:eastAsia="Times New Roman" w:hAnsi="Times New Roman" w:cs="Times New Roman"/>
-                <w:color w:val="000000"/>
-                <w:sz w:val="28"/>
-                <w:szCs w:val="28"/>
-                <w:lang w:eastAsia="ru-RU"/>
-              </w:rPr>
-              <w:t xml:space="preserve">нет </w:t>
+            <w:tcW w:w="8647" w:type="dxa"/>
+            <w:tcBorders>
+              <w:top w:val="nil"/>
+              <w:left w:val="nil"/>
+              <w:bottom w:val="nil"/>
+              <w:right w:val="nil"/>
+            </w:tcBorders>
+            <w:shd w:val="clear" w:color="auto" w:fill="auto"/>
+            <w:noWrap/>
+            <w:vAlign w:val="bottom"/>
+            <w:hideMark/>
+          </w:tcPr>
+          <w:p>
+            <w:pPr>
+              <w:spacing w:after="0" w:line="240" w:lineRule="auto"/>
+              <w:rPr>
+                <w:rFonts w:ascii="Times New Roman" w:eastAsia="Times New Roman" w:hAnsi="Times New Roman" w:cs="Times New Roman"/>
+                <w:color w:val="000000"/>
+                <w:sz w:val="28"/>
+                <w:szCs w:val="28"/>
+                <w:lang w:eastAsia="ru-RU"/>
+              </w:rPr>
+            </w:pPr>
+          </w:p>
+          <w:p>
+            <w:pPr>
+              <w:spacing w:after="0" w:line="240" w:lineRule="auto"/>
+              <w:rPr>
+                <w:rFonts w:ascii="Times New Roman" w:eastAsia="Times New Roman" w:hAnsi="Times New Roman" w:cs="Times New Roman"/>
+                <w:color w:val="000000"/>
+                <w:sz w:val="28"/>
+                <w:szCs w:val="28"/>
+                <w:lang w:eastAsia="ru-RU"/>
+              </w:rPr>
+            </w:pPr>
+            <w:r>
+              <w:rPr>
+                <w:rFonts w:ascii="Times New Roman" w:eastAsia="Times New Roman" w:hAnsi="Times New Roman" w:cs="Times New Roman"/>
+                <w:color w:val="000000"/>
+                <w:sz w:val="28"/>
+                <w:szCs w:val="28"/>
+                <w:lang w:eastAsia="ru-RU"/>
+              </w:rPr>
+              <w:t>Если есть</w:t>
+            </w:r>
+            <w:r>
+              <w:rPr>
+                <w:rFonts w:ascii="Times New Roman" w:eastAsia="Times New Roman" w:hAnsi="Times New Roman" w:cs="Times New Roman"/>
+                <w:color w:val="000000"/>
+                <w:sz w:val="28"/>
+                <w:szCs w:val="28"/>
+                <w:lang w:eastAsia="ru-RU"/>
+              </w:rPr>
+              <w:t xml:space="preserve"> </w:t>
             </w:r>
             <w:r>
               <w:rPr>
@@ -21289,17 +22156,6 @@
                 <w:lang w:eastAsia="ru-RU"/>
               </w:rPr>
               <w:t>:</w:t>
-            </w:r>
-            <w:r>
-              <w:rPr>
-                <w:rFonts w:ascii="Times New Roman" w:eastAsia="Times New Roman" w:hAnsi="Times New Roman" w:cs="Times New Roman"/>
-                <w:b/>
-                <w:color w:val="000000"/>
-                <w:sz w:val="28"/>
-                <w:szCs w:val="28"/>
-                <w:lang w:eastAsia="ru-RU"/>
-              </w:rPr>
-              <w:t xml:space="preserve"> Возврат к началу цикла</w:t>
             </w:r>
           </w:p>
         </w:tc>
@@ -21310,50 +22166,48 @@
         </w:trPr>
         <w:tc>
           <w:tcPr>
-            <w:tcW w:w="9229" w:type="dxa"/>
-            <w:tcBorders>
-              <w:top w:val="nil"/>
-              <w:left w:val="nil"/>
-              <w:bottom w:val="nil"/>
-              <w:right w:val="nil"/>
-            </w:tcBorders>
-            <w:shd w:val="clear" w:color="auto" w:fill="auto"/>
-            <w:noWrap/>
-            <w:vAlign w:val="bottom"/>
-            <w:hideMark/>
-          </w:tcPr>
-          <w:p>
-            <w:pPr>
-              <w:spacing w:after="0" w:line="240" w:lineRule="auto"/>
-              <w:rPr>
-                <w:rFonts w:ascii="Times New Roman" w:eastAsia="Times New Roman" w:hAnsi="Times New Roman" w:cs="Times New Roman"/>
-                <w:color w:val="000000"/>
-                <w:sz w:val="28"/>
-                <w:szCs w:val="28"/>
-                <w:lang w:eastAsia="ru-RU"/>
-              </w:rPr>
-            </w:pPr>
-          </w:p>
-          <w:p>
-            <w:pPr>
-              <w:spacing w:after="0" w:line="240" w:lineRule="auto"/>
-              <w:rPr>
-                <w:rFonts w:ascii="Times New Roman" w:eastAsia="Times New Roman" w:hAnsi="Times New Roman" w:cs="Times New Roman"/>
-                <w:color w:val="000000"/>
-                <w:sz w:val="28"/>
-                <w:szCs w:val="28"/>
-                <w:lang w:eastAsia="ru-RU"/>
-              </w:rPr>
-            </w:pPr>
-            <w:r>
-              <w:rPr>
-                <w:rFonts w:ascii="Times New Roman" w:eastAsia="Times New Roman" w:hAnsi="Times New Roman" w:cs="Times New Roman"/>
-                <w:color w:val="000000"/>
-                <w:sz w:val="28"/>
-                <w:szCs w:val="28"/>
-                <w:lang w:eastAsia="ru-RU"/>
-              </w:rPr>
-              <w:t>Если есть</w:t>
+            <w:tcW w:w="8647" w:type="dxa"/>
+            <w:tcBorders>
+              <w:top w:val="nil"/>
+              <w:left w:val="nil"/>
+              <w:bottom w:val="nil"/>
+              <w:right w:val="nil"/>
+            </w:tcBorders>
+            <w:shd w:val="clear" w:color="auto" w:fill="auto"/>
+            <w:noWrap/>
+            <w:vAlign w:val="bottom"/>
+            <w:hideMark/>
+          </w:tcPr>
+          <w:p>
+            <w:pPr>
+              <w:spacing w:after="0" w:line="240" w:lineRule="auto"/>
+              <w:rPr>
+                <w:rFonts w:ascii="Times New Roman" w:eastAsia="Times New Roman" w:hAnsi="Times New Roman" w:cs="Times New Roman"/>
+                <w:color w:val="000000"/>
+                <w:sz w:val="28"/>
+                <w:szCs w:val="28"/>
+                <w:lang w:eastAsia="ru-RU"/>
+              </w:rPr>
+            </w:pPr>
+            <w:r>
+              <w:rPr>
+                <w:rFonts w:ascii="Times New Roman" w:eastAsia="Times New Roman" w:hAnsi="Times New Roman" w:cs="Times New Roman"/>
+                <w:color w:val="000000"/>
+                <w:sz w:val="28"/>
+                <w:szCs w:val="28"/>
+                <w:lang w:eastAsia="ru-RU"/>
+              </w:rPr>
+              <w:t>Определение длины пакета</w:t>
+            </w:r>
+            <w:r>
+              <w:rPr>
+                <w:rFonts w:ascii="Times New Roman" w:eastAsia="Times New Roman" w:hAnsi="Times New Roman" w:cs="Times New Roman"/>
+                <w:color w:val="000000"/>
+                <w:sz w:val="28"/>
+                <w:szCs w:val="28"/>
+                <w:lang w:eastAsia="ru-RU"/>
+              </w:rPr>
+              <w:t>.</w:t>
             </w:r>
             <w:r>
               <w:rPr>
@@ -21364,26 +22218,6 @@
                 <w:lang w:eastAsia="ru-RU"/>
               </w:rPr>
               <w:t xml:space="preserve"> </w:t>
-            </w:r>
-            <w:r>
-              <w:rPr>
-                <w:rFonts w:ascii="Times New Roman" w:eastAsia="Times New Roman" w:hAnsi="Times New Roman" w:cs="Times New Roman"/>
-                <w:color w:val="000000"/>
-                <w:sz w:val="28"/>
-                <w:szCs w:val="28"/>
-                <w:lang w:eastAsia="ru-RU"/>
-              </w:rPr>
-              <w:t>Прием пакета ЦПКУ</w:t>
-            </w:r>
-            <w:r>
-              <w:rPr>
-                <w:rFonts w:ascii="Times New Roman" w:eastAsia="Times New Roman" w:hAnsi="Times New Roman" w:cs="Times New Roman"/>
-                <w:color w:val="000000"/>
-                <w:sz w:val="28"/>
-                <w:szCs w:val="28"/>
-                <w:lang w:eastAsia="ru-RU"/>
-              </w:rPr>
-              <w:t>:</w:t>
             </w:r>
           </w:p>
         </w:tc>
@@ -21394,58 +22228,38 @@
         </w:trPr>
         <w:tc>
           <w:tcPr>
-            <w:tcW w:w="9229" w:type="dxa"/>
-            <w:tcBorders>
-              <w:top w:val="nil"/>
-              <w:left w:val="nil"/>
-              <w:bottom w:val="nil"/>
-              <w:right w:val="nil"/>
-            </w:tcBorders>
-            <w:shd w:val="clear" w:color="auto" w:fill="auto"/>
-            <w:noWrap/>
-            <w:vAlign w:val="bottom"/>
-            <w:hideMark/>
-          </w:tcPr>
-          <w:p>
-            <w:pPr>
-              <w:spacing w:after="0" w:line="240" w:lineRule="auto"/>
-              <w:rPr>
-                <w:rFonts w:ascii="Times New Roman" w:eastAsia="Times New Roman" w:hAnsi="Times New Roman" w:cs="Times New Roman"/>
-                <w:color w:val="000000"/>
-                <w:sz w:val="28"/>
-                <w:szCs w:val="28"/>
-                <w:lang w:eastAsia="ru-RU"/>
-              </w:rPr>
-            </w:pPr>
-            <w:r>
-              <w:rPr>
-                <w:rFonts w:ascii="Times New Roman" w:eastAsia="Times New Roman" w:hAnsi="Times New Roman" w:cs="Times New Roman"/>
-                <w:color w:val="000000"/>
-                <w:sz w:val="28"/>
-                <w:szCs w:val="28"/>
-                <w:lang w:eastAsia="ru-RU"/>
-              </w:rPr>
-              <w:t>Определение длины пакета</w:t>
-            </w:r>
-            <w:r>
-              <w:rPr>
-                <w:rFonts w:ascii="Times New Roman" w:eastAsia="Times New Roman" w:hAnsi="Times New Roman" w:cs="Times New Roman"/>
-                <w:color w:val="000000"/>
-                <w:sz w:val="28"/>
-                <w:szCs w:val="28"/>
-                <w:lang w:eastAsia="ru-RU"/>
-              </w:rPr>
-              <w:t>.</w:t>
-            </w:r>
-            <w:r>
-              <w:rPr>
-                <w:rFonts w:ascii="Times New Roman" w:eastAsia="Times New Roman" w:hAnsi="Times New Roman" w:cs="Times New Roman"/>
-                <w:color w:val="000000"/>
-                <w:sz w:val="28"/>
-                <w:szCs w:val="28"/>
-                <w:lang w:eastAsia="ru-RU"/>
-              </w:rPr>
-              <w:t xml:space="preserve"> </w:t>
+            <w:tcW w:w="8647" w:type="dxa"/>
+            <w:tcBorders>
+              <w:top w:val="nil"/>
+              <w:left w:val="nil"/>
+              <w:bottom w:val="nil"/>
+              <w:right w:val="nil"/>
+            </w:tcBorders>
+            <w:shd w:val="clear" w:color="auto" w:fill="auto"/>
+            <w:noWrap/>
+            <w:vAlign w:val="bottom"/>
+            <w:hideMark/>
+          </w:tcPr>
+          <w:p>
+            <w:pPr>
+              <w:spacing w:after="0" w:line="240" w:lineRule="auto"/>
+              <w:rPr>
+                <w:rFonts w:ascii="Times New Roman" w:eastAsia="Times New Roman" w:hAnsi="Times New Roman" w:cs="Times New Roman"/>
+                <w:color w:val="000000"/>
+                <w:sz w:val="28"/>
+                <w:szCs w:val="28"/>
+                <w:lang w:eastAsia="ru-RU"/>
+              </w:rPr>
+            </w:pPr>
+            <w:r>
+              <w:rPr>
+                <w:rFonts w:ascii="Times New Roman" w:eastAsia="Times New Roman" w:hAnsi="Times New Roman" w:cs="Times New Roman"/>
+                <w:color w:val="000000"/>
+                <w:sz w:val="28"/>
+                <w:szCs w:val="28"/>
+                <w:lang w:eastAsia="ru-RU"/>
+              </w:rPr>
+              <w:t>Если «общая»-&gt; Управление током КАН</w:t>
             </w:r>
           </w:p>
         </w:tc>
@@ -21456,38 +22270,50 @@
         </w:trPr>
         <w:tc>
           <w:tcPr>
-            <w:tcW w:w="9229" w:type="dxa"/>
-            <w:tcBorders>
-              <w:top w:val="nil"/>
-              <w:left w:val="nil"/>
-              <w:bottom w:val="nil"/>
-              <w:right w:val="nil"/>
-            </w:tcBorders>
-            <w:shd w:val="clear" w:color="auto" w:fill="auto"/>
-            <w:noWrap/>
-            <w:vAlign w:val="bottom"/>
-            <w:hideMark/>
-          </w:tcPr>
-          <w:p>
-            <w:pPr>
-              <w:spacing w:after="0" w:line="240" w:lineRule="auto"/>
-              <w:rPr>
-                <w:rFonts w:ascii="Times New Roman" w:eastAsia="Times New Roman" w:hAnsi="Times New Roman" w:cs="Times New Roman"/>
-                <w:color w:val="000000"/>
-                <w:sz w:val="28"/>
-                <w:szCs w:val="28"/>
-                <w:lang w:eastAsia="ru-RU"/>
-              </w:rPr>
-            </w:pPr>
-            <w:r>
-              <w:rPr>
-                <w:rFonts w:ascii="Times New Roman" w:eastAsia="Times New Roman" w:hAnsi="Times New Roman" w:cs="Times New Roman"/>
-                <w:color w:val="000000"/>
-                <w:sz w:val="28"/>
-                <w:szCs w:val="28"/>
-                <w:lang w:eastAsia="ru-RU"/>
-              </w:rPr>
-              <w:t>Если «общая»-&gt; Управление током КАН</w:t>
+            <w:tcW w:w="8647" w:type="dxa"/>
+            <w:tcBorders>
+              <w:top w:val="nil"/>
+              <w:left w:val="nil"/>
+              <w:bottom w:val="nil"/>
+              <w:right w:val="nil"/>
+            </w:tcBorders>
+            <w:shd w:val="clear" w:color="auto" w:fill="auto"/>
+            <w:noWrap/>
+            <w:vAlign w:val="bottom"/>
+            <w:hideMark/>
+          </w:tcPr>
+          <w:p>
+            <w:pPr>
+              <w:spacing w:after="0" w:line="240" w:lineRule="auto"/>
+              <w:rPr>
+                <w:rFonts w:ascii="Times New Roman" w:eastAsia="Times New Roman" w:hAnsi="Times New Roman" w:cs="Times New Roman"/>
+                <w:color w:val="000000"/>
+                <w:sz w:val="28"/>
+                <w:szCs w:val="28"/>
+                <w:lang w:eastAsia="ru-RU"/>
+              </w:rPr>
+            </w:pPr>
+          </w:p>
+          <w:p>
+            <w:pPr>
+              <w:spacing w:after="0" w:line="240" w:lineRule="auto"/>
+              <w:rPr>
+                <w:rFonts w:ascii="Times New Roman" w:eastAsia="Times New Roman" w:hAnsi="Times New Roman" w:cs="Times New Roman"/>
+                <w:color w:val="000000"/>
+                <w:sz w:val="28"/>
+                <w:szCs w:val="28"/>
+                <w:lang w:eastAsia="ru-RU"/>
+              </w:rPr>
+            </w:pPr>
+            <w:r>
+              <w:rPr>
+                <w:rFonts w:ascii="Times New Roman" w:eastAsia="Times New Roman" w:hAnsi="Times New Roman" w:cs="Times New Roman"/>
+                <w:color w:val="000000"/>
+                <w:sz w:val="28"/>
+                <w:szCs w:val="28"/>
+                <w:lang w:eastAsia="ru-RU"/>
+              </w:rPr>
+              <w:t>Обработка команды</w:t>
             </w:r>
           </w:p>
         </w:tc>
@@ -21498,51 +22324,86 @@
         </w:trPr>
         <w:tc>
           <w:tcPr>
-            <w:tcW w:w="9229" w:type="dxa"/>
-            <w:tcBorders>
-              <w:top w:val="nil"/>
-              <w:left w:val="nil"/>
-              <w:bottom w:val="nil"/>
-              <w:right w:val="nil"/>
-            </w:tcBorders>
-            <w:shd w:val="clear" w:color="auto" w:fill="auto"/>
-            <w:noWrap/>
-            <w:vAlign w:val="bottom"/>
-            <w:hideMark/>
-          </w:tcPr>
-          <w:p>
-            <w:pPr>
-              <w:spacing w:after="0" w:line="240" w:lineRule="auto"/>
-              <w:rPr>
-                <w:rFonts w:ascii="Times New Roman" w:eastAsia="Times New Roman" w:hAnsi="Times New Roman" w:cs="Times New Roman"/>
-                <w:color w:val="000000"/>
-                <w:sz w:val="28"/>
-                <w:szCs w:val="28"/>
-                <w:lang w:eastAsia="ru-RU"/>
-              </w:rPr>
-            </w:pPr>
-          </w:p>
-          <w:p>
-            <w:pPr>
-              <w:spacing w:after="0" w:line="240" w:lineRule="auto"/>
-              <w:rPr>
-                <w:rFonts w:ascii="Times New Roman" w:eastAsia="Times New Roman" w:hAnsi="Times New Roman" w:cs="Times New Roman"/>
-                <w:color w:val="000000"/>
-                <w:sz w:val="28"/>
-                <w:szCs w:val="28"/>
-                <w:lang w:eastAsia="ru-RU"/>
-              </w:rPr>
-            </w:pPr>
-            <w:r>
-              <w:rPr>
-                <w:rFonts w:ascii="Times New Roman" w:eastAsia="Times New Roman" w:hAnsi="Times New Roman" w:cs="Times New Roman"/>
-                <w:color w:val="000000"/>
-                <w:sz w:val="28"/>
-                <w:szCs w:val="28"/>
-                <w:lang w:eastAsia="ru-RU"/>
-              </w:rPr>
-              <w:t>Обработка команды</w:t>
-            </w:r>
+            <w:tcW w:w="8647" w:type="dxa"/>
+            <w:tcBorders>
+              <w:top w:val="nil"/>
+              <w:left w:val="nil"/>
+              <w:bottom w:val="nil"/>
+              <w:right w:val="nil"/>
+            </w:tcBorders>
+            <w:shd w:val="clear" w:color="auto" w:fill="auto"/>
+            <w:noWrap/>
+            <w:hideMark/>
+          </w:tcPr>
+          <w:p>
+            <w:pPr>
+              <w:spacing w:after="0"/>
+              <w:rPr>
+                <w:rFonts w:ascii="Times New Roman" w:hAnsi="Times New Roman" w:cs="Times New Roman"/>
+                <w:color w:val="000000"/>
+                <w:sz w:val="28"/>
+                <w:szCs w:val="28"/>
+              </w:rPr>
+            </w:pPr>
+            <w:r>
+              <w:rPr>
+                <w:rFonts w:ascii="Times New Roman" w:hAnsi="Times New Roman" w:cs="Times New Roman"/>
+                <w:color w:val="000000"/>
+                <w:sz w:val="28"/>
+                <w:szCs w:val="28"/>
+              </w:rPr>
+              <w:t xml:space="preserve">Проверка "адреса", если "свой" то </w:t>
+            </w:r>
+            <w:r>
+              <w:rPr>
+                <w:rFonts w:ascii="Times New Roman" w:hAnsi="Times New Roman" w:cs="Times New Roman"/>
+                <w:color w:val="000000"/>
+                <w:sz w:val="28"/>
+                <w:szCs w:val="28"/>
+              </w:rPr>
+              <w:t>Выполнение команды</w:t>
+            </w:r>
+          </w:p>
+          <w:p>
+            <w:pPr>
+              <w:spacing w:after="0"/>
+              <w:rPr>
+                <w:rFonts w:ascii="Times New Roman" w:hAnsi="Times New Roman" w:cs="Times New Roman"/>
+                <w:color w:val="000000"/>
+                <w:sz w:val="28"/>
+                <w:szCs w:val="28"/>
+              </w:rPr>
+            </w:pPr>
+            <w:r>
+              <w:rPr>
+                <w:rFonts w:ascii="Times New Roman" w:hAnsi="Times New Roman" w:cs="Times New Roman"/>
+                <w:color w:val="000000"/>
+                <w:sz w:val="28"/>
+                <w:szCs w:val="28"/>
+              </w:rPr>
+              <w:t xml:space="preserve"> если нет </w:t>
+            </w:r>
+            <w:r>
+              <w:rPr>
+                <w:rFonts w:ascii="Times New Roman" w:hAnsi="Times New Roman" w:cs="Times New Roman"/>
+                <w:color w:val="000000"/>
+                <w:sz w:val="28"/>
+                <w:szCs w:val="28"/>
+              </w:rPr>
+              <w:t>Сброс буфера приема, ожидание пакета ЦПКУ</w:t>
+            </w:r>
+          </w:p>
+          <w:p>
+            <w:pPr>
+              <w:spacing w:after="0" w:line="240" w:lineRule="auto"/>
+              <w:rPr>
+                <w:rFonts w:ascii="Times New Roman" w:eastAsia="Times New Roman" w:hAnsi="Times New Roman" w:cs="Times New Roman"/>
+                <w:color w:val="000000"/>
+                <w:sz w:val="28"/>
+                <w:szCs w:val="28"/>
+                <w:lang w:eastAsia="ru-RU"/>
+              </w:rPr>
+            </w:pPr>
           </w:p>
         </w:tc>
       </w:tr>
@@ -21552,73 +22413,60 @@
         </w:trPr>
         <w:tc>
           <w:tcPr>
-            <w:tcW w:w="9229" w:type="dxa"/>
-            <w:tcBorders>
-              <w:top w:val="nil"/>
-              <w:left w:val="nil"/>
-              <w:bottom w:val="nil"/>
-              <w:right w:val="nil"/>
-            </w:tcBorders>
-            <w:shd w:val="clear" w:color="auto" w:fill="auto"/>
-            <w:noWrap/>
-            <w:hideMark/>
-          </w:tcPr>
-          <w:p>
-            <w:pPr>
-              <w:spacing w:after="0"/>
-              <w:rPr>
-                <w:rFonts w:ascii="Times New Roman" w:hAnsi="Times New Roman" w:cs="Times New Roman"/>
-                <w:color w:val="000000"/>
-                <w:sz w:val="28"/>
-                <w:szCs w:val="28"/>
-              </w:rPr>
-            </w:pPr>
-            <w:r>
-              <w:rPr>
-                <w:rFonts w:ascii="Times New Roman" w:hAnsi="Times New Roman" w:cs="Times New Roman"/>
-                <w:color w:val="000000"/>
-                <w:sz w:val="28"/>
-                <w:szCs w:val="28"/>
-              </w:rPr>
-              <w:t xml:space="preserve">Проверка "адреса", если "свой" то </w:t>
-            </w:r>
-            <w:r>
-              <w:rPr>
-                <w:rFonts w:ascii="Times New Roman" w:hAnsi="Times New Roman" w:cs="Times New Roman"/>
-                <w:color w:val="000000"/>
-                <w:sz w:val="28"/>
-                <w:szCs w:val="28"/>
+            <w:tcW w:w="8647" w:type="dxa"/>
+            <w:tcBorders>
+              <w:top w:val="nil"/>
+              <w:left w:val="nil"/>
+              <w:bottom w:val="nil"/>
+              <w:right w:val="nil"/>
+            </w:tcBorders>
+            <w:shd w:val="clear" w:color="auto" w:fill="auto"/>
+            <w:noWrap/>
+            <w:vAlign w:val="bottom"/>
+            <w:hideMark/>
+          </w:tcPr>
+          <w:p>
+            <w:pPr>
+              <w:spacing w:after="0" w:line="240" w:lineRule="auto"/>
+              <w:rPr>
+                <w:rFonts w:ascii="Times New Roman" w:eastAsia="Times New Roman" w:hAnsi="Times New Roman" w:cs="Times New Roman"/>
+                <w:color w:val="000000"/>
+                <w:sz w:val="28"/>
+                <w:szCs w:val="28"/>
+                <w:lang w:eastAsia="ru-RU"/>
+              </w:rPr>
+            </w:pPr>
+            <w:r>
+              <w:rPr>
+                <w:rFonts w:ascii="Times New Roman" w:eastAsia="Times New Roman" w:hAnsi="Times New Roman" w:cs="Times New Roman"/>
+                <w:color w:val="000000"/>
+                <w:sz w:val="28"/>
+                <w:szCs w:val="28"/>
+                <w:lang w:eastAsia="ru-RU"/>
               </w:rPr>
               <w:t>Выполнение команды</w:t>
             </w:r>
           </w:p>
           <w:p>
             <w:pPr>
-              <w:spacing w:after="0"/>
-              <w:rPr>
-                <w:rFonts w:ascii="Times New Roman" w:hAnsi="Times New Roman" w:cs="Times New Roman"/>
-                <w:color w:val="000000"/>
-                <w:sz w:val="28"/>
-                <w:szCs w:val="28"/>
-              </w:rPr>
-            </w:pPr>
-            <w:r>
-              <w:rPr>
-                <w:rFonts w:ascii="Times New Roman" w:hAnsi="Times New Roman" w:cs="Times New Roman"/>
-                <w:color w:val="000000"/>
-                <w:sz w:val="28"/>
-                <w:szCs w:val="28"/>
-              </w:rPr>
-              <w:t xml:space="preserve"> если нет </w:t>
-            </w:r>
-            <w:r>
-              <w:rPr>
-                <w:rFonts w:ascii="Times New Roman" w:hAnsi="Times New Roman" w:cs="Times New Roman"/>
-                <w:color w:val="000000"/>
-                <w:sz w:val="28"/>
-                <w:szCs w:val="28"/>
-              </w:rPr>
-              <w:t>Сброс буфера приема, ожидание пакета ЦПКУ</w:t>
+              <w:spacing w:after="0" w:line="240" w:lineRule="auto"/>
+              <w:rPr>
+                <w:rFonts w:ascii="Times New Roman" w:eastAsia="Times New Roman" w:hAnsi="Times New Roman" w:cs="Times New Roman"/>
+                <w:color w:val="000000"/>
+                <w:sz w:val="28"/>
+                <w:szCs w:val="28"/>
+                <w:lang w:eastAsia="ru-RU"/>
+              </w:rPr>
+            </w:pPr>
+            <w:r>
+              <w:rPr>
+                <w:rFonts w:ascii="Times New Roman" w:eastAsia="Times New Roman" w:hAnsi="Times New Roman" w:cs="Times New Roman"/>
+                <w:color w:val="000000"/>
+                <w:sz w:val="28"/>
+                <w:szCs w:val="28"/>
+                <w:lang w:eastAsia="ru-RU"/>
+              </w:rPr>
+              <w:t>Выдача соответствующих команд управления периферией</w:t>
             </w:r>
           </w:p>
           <w:p>
@@ -21641,73 +22489,43 @@
         </w:trPr>
         <w:tc>
           <w:tcPr>
-            <w:tcW w:w="9229" w:type="dxa"/>
-            <w:tcBorders>
-              <w:top w:val="nil"/>
-              <w:left w:val="nil"/>
-              <w:bottom w:val="nil"/>
-              <w:right w:val="nil"/>
-            </w:tcBorders>
-            <w:shd w:val="clear" w:color="auto" w:fill="auto"/>
-            <w:noWrap/>
-            <w:vAlign w:val="bottom"/>
-            <w:hideMark/>
-          </w:tcPr>
-          <w:p>
-            <w:pPr>
-              <w:spacing w:after="0" w:line="240" w:lineRule="auto"/>
-              <w:rPr>
-                <w:rFonts w:ascii="Times New Roman" w:eastAsia="Times New Roman" w:hAnsi="Times New Roman" w:cs="Times New Roman"/>
-                <w:color w:val="000000"/>
-                <w:sz w:val="28"/>
-                <w:szCs w:val="28"/>
-                <w:lang w:eastAsia="ru-RU"/>
-              </w:rPr>
-            </w:pPr>
-            <w:r>
-              <w:rPr>
-                <w:rFonts w:ascii="Times New Roman" w:eastAsia="Times New Roman" w:hAnsi="Times New Roman" w:cs="Times New Roman"/>
-                <w:color w:val="000000"/>
-                <w:sz w:val="28"/>
-                <w:szCs w:val="28"/>
-                <w:lang w:eastAsia="ru-RU"/>
-              </w:rPr>
-              <w:t>Выполнение команды</w:t>
-            </w:r>
-          </w:p>
-          <w:p>
-            <w:pPr>
-              <w:spacing w:after="0" w:line="240" w:lineRule="auto"/>
-              <w:rPr>
-                <w:rFonts w:ascii="Times New Roman" w:eastAsia="Times New Roman" w:hAnsi="Times New Roman" w:cs="Times New Roman"/>
-                <w:color w:val="000000"/>
-                <w:sz w:val="28"/>
-                <w:szCs w:val="28"/>
-                <w:lang w:eastAsia="ru-RU"/>
-              </w:rPr>
-            </w:pPr>
-            <w:r>
-              <w:rPr>
-                <w:rFonts w:ascii="Times New Roman" w:eastAsia="Times New Roman" w:hAnsi="Times New Roman" w:cs="Times New Roman"/>
-                <w:color w:val="000000"/>
-                <w:sz w:val="28"/>
-                <w:szCs w:val="28"/>
-                <w:lang w:eastAsia="ru-RU"/>
-              </w:rPr>
-              <w:t>Выдача соответствующих команд управления периферией</w:t>
-            </w:r>
-          </w:p>
-          <w:p>
-            <w:pPr>
-              <w:spacing w:after="0" w:line="240" w:lineRule="auto"/>
-              <w:rPr>
-                <w:rFonts w:ascii="Times New Roman" w:eastAsia="Times New Roman" w:hAnsi="Times New Roman" w:cs="Times New Roman"/>
-                <w:color w:val="000000"/>
-                <w:sz w:val="28"/>
-                <w:szCs w:val="28"/>
-                <w:lang w:eastAsia="ru-RU"/>
-              </w:rPr>
-            </w:pPr>
+            <w:tcW w:w="8647" w:type="dxa"/>
+            <w:tcBorders>
+              <w:top w:val="nil"/>
+              <w:left w:val="nil"/>
+              <w:bottom w:val="nil"/>
+              <w:right w:val="nil"/>
+            </w:tcBorders>
+            <w:shd w:val="clear" w:color="auto" w:fill="auto"/>
+            <w:noWrap/>
+            <w:vAlign w:val="bottom"/>
+            <w:hideMark/>
+          </w:tcPr>
+          <w:p>
+            <w:pPr>
+              <w:spacing w:after="0" w:line="240" w:lineRule="auto"/>
+              <w:rPr>
+                <w:rFonts w:ascii="Times New Roman" w:eastAsia="Times New Roman" w:hAnsi="Times New Roman" w:cs="Times New Roman"/>
+                <w:b/>
+                <w:bCs/>
+                <w:color w:val="000000"/>
+                <w:sz w:val="28"/>
+                <w:szCs w:val="28"/>
+                <w:lang w:eastAsia="ru-RU"/>
+              </w:rPr>
+            </w:pPr>
+            <w:r>
+              <w:rPr>
+                <w:rFonts w:ascii="Times New Roman" w:eastAsia="Times New Roman" w:hAnsi="Times New Roman" w:cs="Times New Roman"/>
+                <w:b/>
+                <w:bCs/>
+                <w:color w:val="000000"/>
+                <w:sz w:val="28"/>
+                <w:szCs w:val="28"/>
+                <w:lang w:eastAsia="ru-RU"/>
+              </w:rPr>
+              <w:t>Формирование ответа</w:t>
+            </w:r>
           </w:p>
         </w:tc>
       </w:tr>
@@ -21717,42 +22535,38 @@
         </w:trPr>
         <w:tc>
           <w:tcPr>
-            <w:tcW w:w="9229" w:type="dxa"/>
-            <w:tcBorders>
-              <w:top w:val="nil"/>
-              <w:left w:val="nil"/>
-              <w:bottom w:val="nil"/>
-              <w:right w:val="nil"/>
-            </w:tcBorders>
-            <w:shd w:val="clear" w:color="auto" w:fill="auto"/>
-            <w:noWrap/>
-            <w:vAlign w:val="bottom"/>
-            <w:hideMark/>
-          </w:tcPr>
-          <w:p>
-            <w:pPr>
-              <w:spacing w:after="0" w:line="240" w:lineRule="auto"/>
-              <w:rPr>
-                <w:rFonts w:ascii="Times New Roman" w:eastAsia="Times New Roman" w:hAnsi="Times New Roman" w:cs="Times New Roman"/>
-                <w:b/>
-                <w:bCs/>
-                <w:color w:val="000000"/>
-                <w:sz w:val="28"/>
-                <w:szCs w:val="28"/>
-                <w:lang w:eastAsia="ru-RU"/>
-              </w:rPr>
-            </w:pPr>
-            <w:r>
-              <w:rPr>
-                <w:rFonts w:ascii="Times New Roman" w:eastAsia="Times New Roman" w:hAnsi="Times New Roman" w:cs="Times New Roman"/>
-                <w:b/>
-                <w:bCs/>
-                <w:color w:val="000000"/>
-                <w:sz w:val="28"/>
-                <w:szCs w:val="28"/>
-                <w:lang w:eastAsia="ru-RU"/>
-              </w:rPr>
-              <w:t>Формирование ответа</w:t>
+            <w:tcW w:w="8647" w:type="dxa"/>
+            <w:tcBorders>
+              <w:top w:val="nil"/>
+              <w:left w:val="nil"/>
+              <w:bottom w:val="nil"/>
+              <w:right w:val="nil"/>
+            </w:tcBorders>
+            <w:shd w:val="clear" w:color="auto" w:fill="auto"/>
+            <w:noWrap/>
+            <w:vAlign w:val="bottom"/>
+            <w:hideMark/>
+          </w:tcPr>
+          <w:p>
+            <w:pPr>
+              <w:spacing w:after="0" w:line="240" w:lineRule="auto"/>
+              <w:rPr>
+                <w:rFonts w:ascii="Times New Roman" w:eastAsia="Times New Roman" w:hAnsi="Times New Roman" w:cs="Times New Roman"/>
+                <w:color w:val="000000"/>
+                <w:sz w:val="28"/>
+                <w:szCs w:val="28"/>
+                <w:lang w:eastAsia="ru-RU"/>
+              </w:rPr>
+            </w:pPr>
+            <w:r>
+              <w:rPr>
+                <w:rFonts w:ascii="Times New Roman" w:eastAsia="Times New Roman" w:hAnsi="Times New Roman" w:cs="Times New Roman"/>
+                <w:color w:val="000000"/>
+                <w:sz w:val="28"/>
+                <w:szCs w:val="28"/>
+                <w:lang w:eastAsia="ru-RU"/>
+              </w:rPr>
+              <w:t>Передача ответа в ЦПКУ</w:t>
             </w:r>
           </w:p>
         </w:tc>
@@ -21763,49 +22577,7 @@
         </w:trPr>
         <w:tc>
           <w:tcPr>
-            <w:tcW w:w="9229" w:type="dxa"/>
-            <w:tcBorders>
-              <w:top w:val="nil"/>
-              <w:left w:val="nil"/>
-              <w:bottom w:val="nil"/>
-              <w:right w:val="nil"/>
-            </w:tcBorders>
-            <w:shd w:val="clear" w:color="auto" w:fill="auto"/>
-            <w:noWrap/>
-            <w:vAlign w:val="bottom"/>
-            <w:hideMark/>
-          </w:tcPr>
-          <w:p>
-            <w:pPr>
-              <w:spacing w:after="0" w:line="240" w:lineRule="auto"/>
-              <w:rPr>
-                <w:rFonts w:ascii="Times New Roman" w:eastAsia="Times New Roman" w:hAnsi="Times New Roman" w:cs="Times New Roman"/>
-                <w:color w:val="000000"/>
-                <w:sz w:val="28"/>
-                <w:szCs w:val="28"/>
-                <w:lang w:eastAsia="ru-RU"/>
-              </w:rPr>
-            </w:pPr>
-            <w:r>
-              <w:rPr>
-                <w:rFonts w:ascii="Times New Roman" w:eastAsia="Times New Roman" w:hAnsi="Times New Roman" w:cs="Times New Roman"/>
-                <w:color w:val="000000"/>
-                <w:sz w:val="28"/>
-                <w:szCs w:val="28"/>
-                <w:lang w:eastAsia="ru-RU"/>
-              </w:rPr>
-              <w:t>Передача ответа в ЦПКУ</w:t>
-            </w:r>
-          </w:p>
-        </w:tc>
-      </w:tr>
-      <w:tr>
-        <w:trPr>
-          <w:trHeight w:val="300"/>
-        </w:trPr>
-        <w:tc>
-          <w:tcPr>
-            <w:tcW w:w="9229" w:type="dxa"/>
+            <w:tcW w:w="8647" w:type="dxa"/>
             <w:tcBorders>
               <w:top w:val="nil"/>
               <w:left w:val="nil"/>
@@ -22384,6 +23156,7 @@
           <w:sz w:val="28"/>
           <w:szCs w:val="28"/>
         </w:rPr>
+        <w:lastRenderedPageBreak/>
         <w:t>Задать требуемую конфигурацию контроллера.</w:t>
       </w:r>
     </w:p>
@@ -22577,7 +23350,6 @@
           <w:sz w:val="24"/>
           <w:szCs w:val="24"/>
         </w:rPr>
-        <w:lastRenderedPageBreak/>
         <w:t xml:space="preserve">ПРОТОКОЛ обмена ЦПКУ и УИПС1.                                                   </w:t>
       </w:r>
       <w:r>
@@ -23821,6 +24593,7 @@
               <w:rPr>
                 <w:lang w:val="en-US"/>
               </w:rPr>
+              <w:lastRenderedPageBreak/>
               <w:t>dHy</w:t>
             </w:r>
             <w:proofErr w:type="spellEnd"/>
@@ -24211,6 +24984,7 @@
         <w:rPr>
           <w:b/>
           <w:bCs/>
+          <w:lang w:val="en-US"/>
         </w:rPr>
       </w:pPr>
       <w:r>
@@ -24218,7 +24992,6 @@
           <w:b/>
           <w:bCs/>
         </w:rPr>
-        <w:lastRenderedPageBreak/>
         <w:t>2.3 Команды управления контроллерами.</w:t>
       </w:r>
     </w:p>
@@ -25214,8 +25987,464 @@
       </w:rPr>
     </w:lvl>
   </w:abstractNum>
+  <w:abstractNum w:abstractNumId="1" w15:restartNumberingAfterBreak="0">
+    <w:nsid w:val="17C467BD"/>
+    <w:multiLevelType w:val="multilevel"/>
+    <w:tmpl w:val="340627CA"/>
+    <w:lvl w:ilvl="0">
+      <w:start w:val="1"/>
+      <w:numFmt w:val="bullet"/>
+      <w:lvlText w:val=""/>
+      <w:lvlJc w:val="left"/>
+      <w:pPr>
+        <w:tabs>
+          <w:tab w:val="num" w:pos="720"/>
+        </w:tabs>
+        <w:ind w:left="720" w:hanging="360"/>
+      </w:pPr>
+      <w:rPr>
+        <w:rFonts w:ascii="Symbol" w:hAnsi="Symbol" w:hint="default"/>
+        <w:sz w:val="20"/>
+      </w:rPr>
+    </w:lvl>
+    <w:lvl w:ilvl="1" w:tentative="1">
+      <w:start w:val="1"/>
+      <w:numFmt w:val="bullet"/>
+      <w:lvlText w:val="o"/>
+      <w:lvlJc w:val="left"/>
+      <w:pPr>
+        <w:tabs>
+          <w:tab w:val="num" w:pos="1440"/>
+        </w:tabs>
+        <w:ind w:left="1440" w:hanging="360"/>
+      </w:pPr>
+      <w:rPr>
+        <w:rFonts w:ascii="Courier New" w:hAnsi="Courier New" w:hint="default"/>
+        <w:sz w:val="20"/>
+      </w:rPr>
+    </w:lvl>
+    <w:lvl w:ilvl="2" w:tentative="1">
+      <w:start w:val="1"/>
+      <w:numFmt w:val="bullet"/>
+      <w:lvlText w:val=""/>
+      <w:lvlJc w:val="left"/>
+      <w:pPr>
+        <w:tabs>
+          <w:tab w:val="num" w:pos="2160"/>
+        </w:tabs>
+        <w:ind w:left="2160" w:hanging="360"/>
+      </w:pPr>
+      <w:rPr>
+        <w:rFonts w:ascii="Wingdings" w:hAnsi="Wingdings" w:hint="default"/>
+        <w:sz w:val="20"/>
+      </w:rPr>
+    </w:lvl>
+    <w:lvl w:ilvl="3" w:tentative="1">
+      <w:start w:val="1"/>
+      <w:numFmt w:val="bullet"/>
+      <w:lvlText w:val=""/>
+      <w:lvlJc w:val="left"/>
+      <w:pPr>
+        <w:tabs>
+          <w:tab w:val="num" w:pos="2880"/>
+        </w:tabs>
+        <w:ind w:left="2880" w:hanging="360"/>
+      </w:pPr>
+      <w:rPr>
+        <w:rFonts w:ascii="Wingdings" w:hAnsi="Wingdings" w:hint="default"/>
+        <w:sz w:val="20"/>
+      </w:rPr>
+    </w:lvl>
+    <w:lvl w:ilvl="4" w:tentative="1">
+      <w:start w:val="1"/>
+      <w:numFmt w:val="bullet"/>
+      <w:lvlText w:val=""/>
+      <w:lvlJc w:val="left"/>
+      <w:pPr>
+        <w:tabs>
+          <w:tab w:val="num" w:pos="3600"/>
+        </w:tabs>
+        <w:ind w:left="3600" w:hanging="360"/>
+      </w:pPr>
+      <w:rPr>
+        <w:rFonts w:ascii="Wingdings" w:hAnsi="Wingdings" w:hint="default"/>
+        <w:sz w:val="20"/>
+      </w:rPr>
+    </w:lvl>
+    <w:lvl w:ilvl="5" w:tentative="1">
+      <w:start w:val="1"/>
+      <w:numFmt w:val="bullet"/>
+      <w:lvlText w:val=""/>
+      <w:lvlJc w:val="left"/>
+      <w:pPr>
+        <w:tabs>
+          <w:tab w:val="num" w:pos="4320"/>
+        </w:tabs>
+        <w:ind w:left="4320" w:hanging="360"/>
+      </w:pPr>
+      <w:rPr>
+        <w:rFonts w:ascii="Wingdings" w:hAnsi="Wingdings" w:hint="default"/>
+        <w:sz w:val="20"/>
+      </w:rPr>
+    </w:lvl>
+    <w:lvl w:ilvl="6" w:tentative="1">
+      <w:start w:val="1"/>
+      <w:numFmt w:val="bullet"/>
+      <w:lvlText w:val=""/>
+      <w:lvlJc w:val="left"/>
+      <w:pPr>
+        <w:tabs>
+          <w:tab w:val="num" w:pos="5040"/>
+        </w:tabs>
+        <w:ind w:left="5040" w:hanging="360"/>
+      </w:pPr>
+      <w:rPr>
+        <w:rFonts w:ascii="Wingdings" w:hAnsi="Wingdings" w:hint="default"/>
+        <w:sz w:val="20"/>
+      </w:rPr>
+    </w:lvl>
+    <w:lvl w:ilvl="7" w:tentative="1">
+      <w:start w:val="1"/>
+      <w:numFmt w:val="bullet"/>
+      <w:lvlText w:val=""/>
+      <w:lvlJc w:val="left"/>
+      <w:pPr>
+        <w:tabs>
+          <w:tab w:val="num" w:pos="5760"/>
+        </w:tabs>
+        <w:ind w:left="5760" w:hanging="360"/>
+      </w:pPr>
+      <w:rPr>
+        <w:rFonts w:ascii="Wingdings" w:hAnsi="Wingdings" w:hint="default"/>
+        <w:sz w:val="20"/>
+      </w:rPr>
+    </w:lvl>
+    <w:lvl w:ilvl="8" w:tentative="1">
+      <w:start w:val="1"/>
+      <w:numFmt w:val="bullet"/>
+      <w:lvlText w:val=""/>
+      <w:lvlJc w:val="left"/>
+      <w:pPr>
+        <w:tabs>
+          <w:tab w:val="num" w:pos="6480"/>
+        </w:tabs>
+        <w:ind w:left="6480" w:hanging="360"/>
+      </w:pPr>
+      <w:rPr>
+        <w:rFonts w:ascii="Wingdings" w:hAnsi="Wingdings" w:hint="default"/>
+        <w:sz w:val="20"/>
+      </w:rPr>
+    </w:lvl>
+  </w:abstractNum>
+  <w:abstractNum w:abstractNumId="2" w15:restartNumberingAfterBreak="0">
+    <w:nsid w:val="29391965"/>
+    <w:multiLevelType w:val="multilevel"/>
+    <w:tmpl w:val="DD0A465C"/>
+    <w:lvl w:ilvl="0">
+      <w:start w:val="1"/>
+      <w:numFmt w:val="bullet"/>
+      <w:lvlText w:val=""/>
+      <w:lvlJc w:val="left"/>
+      <w:pPr>
+        <w:tabs>
+          <w:tab w:val="num" w:pos="720"/>
+        </w:tabs>
+        <w:ind w:left="720" w:hanging="360"/>
+      </w:pPr>
+      <w:rPr>
+        <w:rFonts w:ascii="Symbol" w:hAnsi="Symbol" w:hint="default"/>
+        <w:sz w:val="20"/>
+      </w:rPr>
+    </w:lvl>
+    <w:lvl w:ilvl="1" w:tentative="1">
+      <w:start w:val="1"/>
+      <w:numFmt w:val="bullet"/>
+      <w:lvlText w:val="o"/>
+      <w:lvlJc w:val="left"/>
+      <w:pPr>
+        <w:tabs>
+          <w:tab w:val="num" w:pos="1440"/>
+        </w:tabs>
+        <w:ind w:left="1440" w:hanging="360"/>
+      </w:pPr>
+      <w:rPr>
+        <w:rFonts w:ascii="Courier New" w:hAnsi="Courier New" w:hint="default"/>
+        <w:sz w:val="20"/>
+      </w:rPr>
+    </w:lvl>
+    <w:lvl w:ilvl="2" w:tentative="1">
+      <w:start w:val="1"/>
+      <w:numFmt w:val="bullet"/>
+      <w:lvlText w:val=""/>
+      <w:lvlJc w:val="left"/>
+      <w:pPr>
+        <w:tabs>
+          <w:tab w:val="num" w:pos="2160"/>
+        </w:tabs>
+        <w:ind w:left="2160" w:hanging="360"/>
+      </w:pPr>
+      <w:rPr>
+        <w:rFonts w:ascii="Wingdings" w:hAnsi="Wingdings" w:hint="default"/>
+        <w:sz w:val="20"/>
+      </w:rPr>
+    </w:lvl>
+    <w:lvl w:ilvl="3" w:tentative="1">
+      <w:start w:val="1"/>
+      <w:numFmt w:val="bullet"/>
+      <w:lvlText w:val=""/>
+      <w:lvlJc w:val="left"/>
+      <w:pPr>
+        <w:tabs>
+          <w:tab w:val="num" w:pos="2880"/>
+        </w:tabs>
+        <w:ind w:left="2880" w:hanging="360"/>
+      </w:pPr>
+      <w:rPr>
+        <w:rFonts w:ascii="Wingdings" w:hAnsi="Wingdings" w:hint="default"/>
+        <w:sz w:val="20"/>
+      </w:rPr>
+    </w:lvl>
+    <w:lvl w:ilvl="4" w:tentative="1">
+      <w:start w:val="1"/>
+      <w:numFmt w:val="bullet"/>
+      <w:lvlText w:val=""/>
+      <w:lvlJc w:val="left"/>
+      <w:pPr>
+        <w:tabs>
+          <w:tab w:val="num" w:pos="3600"/>
+        </w:tabs>
+        <w:ind w:left="3600" w:hanging="360"/>
+      </w:pPr>
+      <w:rPr>
+        <w:rFonts w:ascii="Wingdings" w:hAnsi="Wingdings" w:hint="default"/>
+        <w:sz w:val="20"/>
+      </w:rPr>
+    </w:lvl>
+    <w:lvl w:ilvl="5" w:tentative="1">
+      <w:start w:val="1"/>
+      <w:numFmt w:val="bullet"/>
+      <w:lvlText w:val=""/>
+      <w:lvlJc w:val="left"/>
+      <w:pPr>
+        <w:tabs>
+          <w:tab w:val="num" w:pos="4320"/>
+        </w:tabs>
+        <w:ind w:left="4320" w:hanging="360"/>
+      </w:pPr>
+      <w:rPr>
+        <w:rFonts w:ascii="Wingdings" w:hAnsi="Wingdings" w:hint="default"/>
+        <w:sz w:val="20"/>
+      </w:rPr>
+    </w:lvl>
+    <w:lvl w:ilvl="6" w:tentative="1">
+      <w:start w:val="1"/>
+      <w:numFmt w:val="bullet"/>
+      <w:lvlText w:val=""/>
+      <w:lvlJc w:val="left"/>
+      <w:pPr>
+        <w:tabs>
+          <w:tab w:val="num" w:pos="5040"/>
+        </w:tabs>
+        <w:ind w:left="5040" w:hanging="360"/>
+      </w:pPr>
+      <w:rPr>
+        <w:rFonts w:ascii="Wingdings" w:hAnsi="Wingdings" w:hint="default"/>
+        <w:sz w:val="20"/>
+      </w:rPr>
+    </w:lvl>
+    <w:lvl w:ilvl="7" w:tentative="1">
+      <w:start w:val="1"/>
+      <w:numFmt w:val="bullet"/>
+      <w:lvlText w:val=""/>
+      <w:lvlJc w:val="left"/>
+      <w:pPr>
+        <w:tabs>
+          <w:tab w:val="num" w:pos="5760"/>
+        </w:tabs>
+        <w:ind w:left="5760" w:hanging="360"/>
+      </w:pPr>
+      <w:rPr>
+        <w:rFonts w:ascii="Wingdings" w:hAnsi="Wingdings" w:hint="default"/>
+        <w:sz w:val="20"/>
+      </w:rPr>
+    </w:lvl>
+    <w:lvl w:ilvl="8" w:tentative="1">
+      <w:start w:val="1"/>
+      <w:numFmt w:val="bullet"/>
+      <w:lvlText w:val=""/>
+      <w:lvlJc w:val="left"/>
+      <w:pPr>
+        <w:tabs>
+          <w:tab w:val="num" w:pos="6480"/>
+        </w:tabs>
+        <w:ind w:left="6480" w:hanging="360"/>
+      </w:pPr>
+      <w:rPr>
+        <w:rFonts w:ascii="Wingdings" w:hAnsi="Wingdings" w:hint="default"/>
+        <w:sz w:val="20"/>
+      </w:rPr>
+    </w:lvl>
+  </w:abstractNum>
+  <w:abstractNum w:abstractNumId="3" w15:restartNumberingAfterBreak="0">
+    <w:nsid w:val="58447F76"/>
+    <w:multiLevelType w:val="multilevel"/>
+    <w:tmpl w:val="72A81DCC"/>
+    <w:lvl w:ilvl="0">
+      <w:start w:val="1"/>
+      <w:numFmt w:val="bullet"/>
+      <w:lvlText w:val=""/>
+      <w:lvlJc w:val="left"/>
+      <w:pPr>
+        <w:tabs>
+          <w:tab w:val="num" w:pos="720"/>
+        </w:tabs>
+        <w:ind w:left="720" w:hanging="360"/>
+      </w:pPr>
+      <w:rPr>
+        <w:rFonts w:ascii="Symbol" w:hAnsi="Symbol" w:hint="default"/>
+        <w:sz w:val="20"/>
+      </w:rPr>
+    </w:lvl>
+    <w:lvl w:ilvl="1" w:tentative="1">
+      <w:start w:val="1"/>
+      <w:numFmt w:val="bullet"/>
+      <w:lvlText w:val="o"/>
+      <w:lvlJc w:val="left"/>
+      <w:pPr>
+        <w:tabs>
+          <w:tab w:val="num" w:pos="1440"/>
+        </w:tabs>
+        <w:ind w:left="1440" w:hanging="360"/>
+      </w:pPr>
+      <w:rPr>
+        <w:rFonts w:ascii="Courier New" w:hAnsi="Courier New" w:hint="default"/>
+        <w:sz w:val="20"/>
+      </w:rPr>
+    </w:lvl>
+    <w:lvl w:ilvl="2" w:tentative="1">
+      <w:start w:val="1"/>
+      <w:numFmt w:val="bullet"/>
+      <w:lvlText w:val=""/>
+      <w:lvlJc w:val="left"/>
+      <w:pPr>
+        <w:tabs>
+          <w:tab w:val="num" w:pos="2160"/>
+        </w:tabs>
+        <w:ind w:left="2160" w:hanging="360"/>
+      </w:pPr>
+      <w:rPr>
+        <w:rFonts w:ascii="Wingdings" w:hAnsi="Wingdings" w:hint="default"/>
+        <w:sz w:val="20"/>
+      </w:rPr>
+    </w:lvl>
+    <w:lvl w:ilvl="3" w:tentative="1">
+      <w:start w:val="1"/>
+      <w:numFmt w:val="bullet"/>
+      <w:lvlText w:val=""/>
+      <w:lvlJc w:val="left"/>
+      <w:pPr>
+        <w:tabs>
+          <w:tab w:val="num" w:pos="2880"/>
+        </w:tabs>
+        <w:ind w:left="2880" w:hanging="360"/>
+      </w:pPr>
+      <w:rPr>
+        <w:rFonts w:ascii="Wingdings" w:hAnsi="Wingdings" w:hint="default"/>
+        <w:sz w:val="20"/>
+      </w:rPr>
+    </w:lvl>
+    <w:lvl w:ilvl="4" w:tentative="1">
+      <w:start w:val="1"/>
+      <w:numFmt w:val="bullet"/>
+      <w:lvlText w:val=""/>
+      <w:lvlJc w:val="left"/>
+      <w:pPr>
+        <w:tabs>
+          <w:tab w:val="num" w:pos="3600"/>
+        </w:tabs>
+        <w:ind w:left="3600" w:hanging="360"/>
+      </w:pPr>
+      <w:rPr>
+        <w:rFonts w:ascii="Wingdings" w:hAnsi="Wingdings" w:hint="default"/>
+        <w:sz w:val="20"/>
+      </w:rPr>
+    </w:lvl>
+    <w:lvl w:ilvl="5" w:tentative="1">
+      <w:start w:val="1"/>
+      <w:numFmt w:val="bullet"/>
+      <w:lvlText w:val=""/>
+      <w:lvlJc w:val="left"/>
+      <w:pPr>
+        <w:tabs>
+          <w:tab w:val="num" w:pos="4320"/>
+        </w:tabs>
+        <w:ind w:left="4320" w:hanging="360"/>
+      </w:pPr>
+      <w:rPr>
+        <w:rFonts w:ascii="Wingdings" w:hAnsi="Wingdings" w:hint="default"/>
+        <w:sz w:val="20"/>
+      </w:rPr>
+    </w:lvl>
+    <w:lvl w:ilvl="6" w:tentative="1">
+      <w:start w:val="1"/>
+      <w:numFmt w:val="bullet"/>
+      <w:lvlText w:val=""/>
+      <w:lvlJc w:val="left"/>
+      <w:pPr>
+        <w:tabs>
+          <w:tab w:val="num" w:pos="5040"/>
+        </w:tabs>
+        <w:ind w:left="5040" w:hanging="360"/>
+      </w:pPr>
+      <w:rPr>
+        <w:rFonts w:ascii="Wingdings" w:hAnsi="Wingdings" w:hint="default"/>
+        <w:sz w:val="20"/>
+      </w:rPr>
+    </w:lvl>
+    <w:lvl w:ilvl="7" w:tentative="1">
+      <w:start w:val="1"/>
+      <w:numFmt w:val="bullet"/>
+      <w:lvlText w:val=""/>
+      <w:lvlJc w:val="left"/>
+      <w:pPr>
+        <w:tabs>
+          <w:tab w:val="num" w:pos="5760"/>
+        </w:tabs>
+        <w:ind w:left="5760" w:hanging="360"/>
+      </w:pPr>
+      <w:rPr>
+        <w:rFonts w:ascii="Wingdings" w:hAnsi="Wingdings" w:hint="default"/>
+        <w:sz w:val="20"/>
+      </w:rPr>
+    </w:lvl>
+    <w:lvl w:ilvl="8" w:tentative="1">
+      <w:start w:val="1"/>
+      <w:numFmt w:val="bullet"/>
+      <w:lvlText w:val=""/>
+      <w:lvlJc w:val="left"/>
+      <w:pPr>
+        <w:tabs>
+          <w:tab w:val="num" w:pos="6480"/>
+        </w:tabs>
+        <w:ind w:left="6480" w:hanging="360"/>
+      </w:pPr>
+      <w:rPr>
+        <w:rFonts w:ascii="Wingdings" w:hAnsi="Wingdings" w:hint="default"/>
+        <w:sz w:val="20"/>
+      </w:rPr>
+    </w:lvl>
+  </w:abstractNum>
   <w:num w:numId="1" w16cid:durableId="1260873280">
     <w:abstractNumId w:val="0"/>
+  </w:num>
+  <w:num w:numId="2" w16cid:durableId="2127190045">
+    <w:abstractNumId w:val="1"/>
+  </w:num>
+  <w:num w:numId="3" w16cid:durableId="1207572448">
+    <w:abstractNumId w:val="2"/>
+  </w:num>
+  <w:num w:numId="4" w16cid:durableId="1311137084">
+    <w:abstractNumId w:val="3"/>
   </w:num>
 </w:numbering>
 </file>
@@ -25642,6 +26871,29 @@
       <w:lang w:eastAsia="ru-RU"/>
     </w:rPr>
   </w:style>
+  <w:style w:type="paragraph" w:styleId="2">
+    <w:name w:val="heading 2"/>
+    <w:basedOn w:val="a"/>
+    <w:next w:val="a"/>
+    <w:link w:val="20"/>
+    <w:uiPriority w:val="9"/>
+    <w:semiHidden/>
+    <w:unhideWhenUsed/>
+    <w:qFormat/>
+    <w:rsid w:val="0011614F"/>
+    <w:pPr>
+      <w:keepNext/>
+      <w:keepLines/>
+      <w:spacing w:before="40" w:after="0"/>
+      <w:outlineLvl w:val="1"/>
+    </w:pPr>
+    <w:rPr>
+      <w:rFonts w:asciiTheme="majorHAnsi" w:eastAsiaTheme="majorEastAsia" w:hAnsiTheme="majorHAnsi" w:cstheme="majorBidi"/>
+      <w:color w:val="365F91" w:themeColor="accent1" w:themeShade="BF"/>
+      <w:sz w:val="26"/>
+      <w:szCs w:val="26"/>
+    </w:rPr>
+  </w:style>
   <w:style w:type="character" w:default="1" w:styleId="a0">
     <w:name w:val="Default Paragraph Font"/>
     <w:uiPriority w:val="1"/>
@@ -25723,6 +26975,127 @@
       <w:sz w:val="32"/>
       <w:szCs w:val="32"/>
       <w:lang w:eastAsia="ru-RU"/>
+    </w:rPr>
+  </w:style>
+  <w:style w:type="character" w:customStyle="1" w:styleId="20">
+    <w:name w:val="Заголовок 2 Знак"/>
+    <w:basedOn w:val="a0"/>
+    <w:link w:val="2"/>
+    <w:uiPriority w:val="9"/>
+    <w:semiHidden/>
+    <w:rsid w:val="0011614F"/>
+    <w:rPr>
+      <w:rFonts w:asciiTheme="majorHAnsi" w:eastAsiaTheme="majorEastAsia" w:hAnsiTheme="majorHAnsi" w:cstheme="majorBidi"/>
+      <w:color w:val="365F91" w:themeColor="accent1" w:themeShade="BF"/>
+      <w:sz w:val="26"/>
+      <w:szCs w:val="26"/>
+    </w:rPr>
+  </w:style>
+  <w:style w:type="paragraph" w:customStyle="1" w:styleId="whitespace-pre-wrap">
+    <w:name w:val="whitespace-pre-wrap"/>
+    <w:basedOn w:val="a"/>
+    <w:rsid w:val="0011614F"/>
+    <w:pPr>
+      <w:spacing w:before="100" w:beforeAutospacing="1" w:after="100" w:afterAutospacing="1" w:line="240" w:lineRule="auto"/>
+    </w:pPr>
+    <w:rPr>
+      <w:rFonts w:ascii="Times New Roman" w:eastAsia="Times New Roman" w:hAnsi="Times New Roman" w:cs="Times New Roman"/>
+      <w:sz w:val="24"/>
+      <w:szCs w:val="24"/>
+      <w:lang w:eastAsia="ru-RU"/>
+    </w:rPr>
+  </w:style>
+  <w:style w:type="paragraph" w:customStyle="1" w:styleId="whitespace-normal">
+    <w:name w:val="whitespace-normal"/>
+    <w:basedOn w:val="a"/>
+    <w:rsid w:val="0011614F"/>
+    <w:pPr>
+      <w:spacing w:before="100" w:beforeAutospacing="1" w:after="100" w:afterAutospacing="1" w:line="240" w:lineRule="auto"/>
+    </w:pPr>
+    <w:rPr>
+      <w:rFonts w:ascii="Times New Roman" w:eastAsia="Times New Roman" w:hAnsi="Times New Roman" w:cs="Times New Roman"/>
+      <w:sz w:val="24"/>
+      <w:szCs w:val="24"/>
+      <w:lang w:eastAsia="ru-RU"/>
+    </w:rPr>
+  </w:style>
+  <w:style w:type="character" w:styleId="a6">
+    <w:name w:val="Strong"/>
+    <w:basedOn w:val="a0"/>
+    <w:uiPriority w:val="22"/>
+    <w:qFormat/>
+    <w:rsid w:val="0011614F"/>
+    <w:rPr>
+      <w:b/>
+      <w:bCs/>
+    </w:rPr>
+  </w:style>
+  <w:style w:type="character" w:customStyle="1" w:styleId="apple-converted-space">
+    <w:name w:val="apple-converted-space"/>
+    <w:basedOn w:val="a0"/>
+    <w:rsid w:val="0011614F"/>
+  </w:style>
+  <w:style w:type="paragraph" w:styleId="HTML">
+    <w:name w:val="HTML Preformatted"/>
+    <w:basedOn w:val="a"/>
+    <w:link w:val="HTML0"/>
+    <w:uiPriority w:val="99"/>
+    <w:semiHidden/>
+    <w:unhideWhenUsed/>
+    <w:rsid w:val="0011614F"/>
+    <w:pPr>
+      <w:tabs>
+        <w:tab w:val="left" w:pos="916"/>
+        <w:tab w:val="left" w:pos="1832"/>
+        <w:tab w:val="left" w:pos="2748"/>
+        <w:tab w:val="left" w:pos="3664"/>
+        <w:tab w:val="left" w:pos="4580"/>
+        <w:tab w:val="left" w:pos="5496"/>
+        <w:tab w:val="left" w:pos="6412"/>
+        <w:tab w:val="left" w:pos="7328"/>
+        <w:tab w:val="left" w:pos="8244"/>
+        <w:tab w:val="left" w:pos="9160"/>
+        <w:tab w:val="left" w:pos="10076"/>
+        <w:tab w:val="left" w:pos="10992"/>
+        <w:tab w:val="left" w:pos="11908"/>
+        <w:tab w:val="left" w:pos="12824"/>
+        <w:tab w:val="left" w:pos="13740"/>
+        <w:tab w:val="left" w:pos="14656"/>
+      </w:tabs>
+      <w:spacing w:after="0" w:line="240" w:lineRule="auto"/>
+    </w:pPr>
+    <w:rPr>
+      <w:rFonts w:ascii="Courier New" w:eastAsia="Times New Roman" w:hAnsi="Courier New" w:cs="Courier New"/>
+      <w:sz w:val="20"/>
+      <w:szCs w:val="20"/>
+      <w:lang w:eastAsia="ru-RU"/>
+    </w:rPr>
+  </w:style>
+  <w:style w:type="character" w:customStyle="1" w:styleId="HTML0">
+    <w:name w:val="Стандартный HTML Знак"/>
+    <w:basedOn w:val="a0"/>
+    <w:link w:val="HTML"/>
+    <w:uiPriority w:val="99"/>
+    <w:semiHidden/>
+    <w:rsid w:val="0011614F"/>
+    <w:rPr>
+      <w:rFonts w:ascii="Courier New" w:eastAsia="Times New Roman" w:hAnsi="Courier New" w:cs="Courier New"/>
+      <w:sz w:val="20"/>
+      <w:szCs w:val="20"/>
+      <w:lang w:eastAsia="ru-RU"/>
+    </w:rPr>
+  </w:style>
+  <w:style w:type="character" w:styleId="HTML1">
+    <w:name w:val="HTML Code"/>
+    <w:basedOn w:val="a0"/>
+    <w:uiPriority w:val="99"/>
+    <w:semiHidden/>
+    <w:unhideWhenUsed/>
+    <w:rsid w:val="0011614F"/>
+    <w:rPr>
+      <w:rFonts w:ascii="Courier New" w:eastAsia="Times New Roman" w:hAnsi="Courier New" w:cs="Courier New"/>
+      <w:sz w:val="20"/>
+      <w:szCs w:val="20"/>
     </w:rPr>
   </w:style>
 </w:styles>

</xml_diff>

<commit_message>
Add PowerManager class and integrate with ADC for voltage source management
</commit_message>
<xml_diff>
--- a/ЗАДАНИЯ.docx
+++ b/ЗАДАНИЯ.docx
@@ -20827,7 +20827,7 @@
                 <w:color w:val="000000"/>
                 <w:sz w:val="28"/>
                 <w:szCs w:val="28"/>
-                <w:lang w:eastAsia="ru-RU"/>
+                <w:lang w:val="en-US" w:eastAsia="ru-RU"/>
               </w:rPr>
             </w:pPr>
             <w:r>
@@ -21669,7 +21669,7 @@
                 <w:color w:val="000000"/>
                 <w:sz w:val="28"/>
                 <w:szCs w:val="28"/>
-                <w:lang w:eastAsia="ru-RU"/>
+                <w:lang w:val="en-US" w:eastAsia="ru-RU"/>
               </w:rPr>
             </w:pPr>
           </w:p>
@@ -24083,6 +24083,31 @@
           <w:bCs/>
         </w:rPr>
         <w:t>2.2 Циркулярная передача расчетных составляющих индукции.</w:t>
+      </w:r>
+      <w:r>
+        <w:rPr>
+          <w:b/>
+          <w:bCs/>
+        </w:rPr>
+        <w:t xml:space="preserve"> </w:t>
+      </w:r>
+      <w:r>
+        <w:rPr>
+          <w:b/>
+          <w:bCs/>
+          <w:color w:val="FF0000"/>
+          <w:lang w:val="en-US"/>
+        </w:rPr>
+        <w:t>Broadcast</w:t>
+      </w:r>
+      <w:r>
+        <w:rPr>
+          <w:b/>
+          <w:bCs/>
+          <w:color w:val="FF0000"/>
+          <w:lang w:val="en-US"/>
+        </w:rPr>
+        <w:t xml:space="preserve"> </w:t>
       </w:r>
     </w:p>
     <w:p>

</xml_diff>